<commit_message>
Rebrand training artefacts with Getamazednow AI Design System v1.0
- Both decks: navy/teal palette remapped to Ink/Signal/Stone brand tokens,
  Poppins headings, brand badge on title slides (layouts, masters, theme incl.)
- Training guide: heading/title colors to Ink + Signal-deep, theme fonts
  to Poppins (headings) / Inter (body); content untouched
</commit_message>
<xml_diff>
--- a/training/docx/GenAI-Observability-Training-Guide.docx
+++ b/training/docx/GenAI-Observability-Training-Guide.docx
@@ -113,10 +113,7 @@
         <w:pStyle w:val="FirstParagraph"/>
       </w:pPr>
       <w:r>
-        <w:t xml:space="preserve">This repository is a</w:t>
-      </w:r>
-      <w:r>
-        <w:t xml:space="preserve"> </w:t>
+        <w:t xml:space="preserve">This repository is a </w:t>
       </w:r>
       <w:r>
         <w:rPr>
@@ -142,52 +139,13 @@
         <w:pStyle w:val="BodyText"/>
       </w:pPr>
       <w:r>
-        <w:t xml:space="preserve">It exists to answer a question every enterprise adopting agentic Gen AI eventually has to answer:</w:t>
-      </w:r>
-      <w:r>
-        <w:t xml:space="preserve"> </w:t>
+        <w:t xml:space="preserve">It exists to answer a question every enterprise adopting agentic Gen AI eventually has to answer: </w:t>
       </w:r>
       <w:r>
         <w:rPr>
           <w:b/>
         </w:rPr>
-        <w:t xml:space="preserve">what does</w:t>
-      </w:r>
-      <w:r>
-        <w:rPr>
-          <w:b/>
-        </w:rPr>
-        <w:t xml:space="preserve"> </w:t>
-      </w:r>
-      <w:r>
-        <w:rPr>
-          <w:b/>
-        </w:rPr>
-        <w:t xml:space="preserve">“</w:t>
-      </w:r>
-      <w:r>
-        <w:rPr>
-          <w:b/>
-        </w:rPr>
-        <w:t xml:space="preserve">observability</w:t>
-      </w:r>
-      <w:r>
-        <w:rPr>
-          <w:b/>
-        </w:rPr>
-        <w:t xml:space="preserve">”</w:t>
-      </w:r>
-      <w:r>
-        <w:rPr>
-          <w:b/>
-        </w:rPr>
-        <w:t xml:space="preserve"> </w:t>
-      </w:r>
-      <w:r>
-        <w:rPr>
-          <w:b/>
-        </w:rPr>
-        <w:t xml:space="preserve">mean for a system that can call tools, move money, retrieve from external sources, and occasionally hallucinate — and how do you actually build that on a platform like Datadog, not just describe it in a slide?</w:t>
+        <w:t>what does “observability” mean for a system that can call tools, move money, retrieve from external sources, and occasionally hallucinate — and how do you actually build that on a platform like Datadog, not just describe it in a slide?</w:t>
       </w:r>
     </w:p>
     <w:p>
@@ -276,10 +234,7 @@
               <w:jc w:val="left"/>
             </w:pPr>
             <w:r>
-              <w:t xml:space="preserve">Was the</w:t>
-            </w:r>
-            <w:r>
-              <w:t xml:space="preserve"> </w:t>
+              <w:t xml:space="preserve">Was the </w:t>
             </w:r>
             <w:r>
               <w:rPr>
@@ -288,10 +243,7 @@
               <w:t xml:space="preserve">business outcome</w:t>
             </w:r>
             <w:r>
-              <w:t xml:space="preserve"> </w:t>
-            </w:r>
-            <w:r>
-              <w:t xml:space="preserve">achieved, or did the agent silently produce a wrong or ungrounded answer?</w:t>
+              <w:t xml:space="preserve"> achieved, or did the agent silently produce a wrong or ungrounded answer?</w:t>
             </w:r>
           </w:p>
         </w:tc>
@@ -416,10 +368,7 @@
         <w:pStyle w:val="FirstParagraph"/>
       </w:pPr>
       <w:r>
-        <w:t xml:space="preserve">Everything in this repository traces back to two documents (included in full under</w:t>
-      </w:r>
-      <w:r>
-        <w:t xml:space="preserve"> </w:t>
+        <w:t xml:space="preserve">Everything in this repository traces back to two documents (included in full under </w:t>
       </w:r>
       <w:r>
         <w:rPr>
@@ -446,13 +395,7 @@
         <w:t xml:space="preserve">AI Observability Metrics Catalogue for Agentic LLM Workflows</w:t>
       </w:r>
       <w:r>
-        <w:t xml:space="preserve"> </w:t>
-      </w:r>
-      <w:r>
-        <w:t xml:space="preserve">(v1.0, 30 Jun 2026) — the</w:t>
-      </w:r>
-      <w:r>
-        <w:t xml:space="preserve"> </w:t>
+        <w:t xml:space="preserve"> (v1.0, 30 Jun 2026) — the </w:t>
       </w:r>
       <w:r>
         <w:rPr>
@@ -461,13 +404,7 @@
         <w:t xml:space="preserve">what to measure and govern</w:t>
       </w:r>
       <w:r>
-        <w:t xml:space="preserve"> </w:t>
-      </w:r>
-      <w:r>
-        <w:t xml:space="preserve">baseline. Roughly 150 metrics across 13 measurement dimensions (cost, performance, scale, reliability, agent behaviour, RAG/grounding, security, responsible AI, incidents, model quality/drift, data/privacy, change/release, and an executive view spanning all of them). Condensed in</w:t>
-      </w:r>
-      <w:r>
-        <w:t xml:space="preserve"> </w:t>
+        <w:t xml:space="preserve"> baseline. Roughly 150 metrics across 13 measurement dimensions (cost, performance, scale, reliability, agent behaviour, RAG/grounding, security, responsible AI, incidents, model quality/drift, data/privacy, change/release, and an executive view spanning all of them). Condensed in </w:t>
       </w:r>
       <w:hyperlink r:id="rId24">
         <w:r>
@@ -496,13 +433,7 @@
         <w:t xml:space="preserve">AI Observability — Datadog Implementation Addendum</w:t>
       </w:r>
       <w:r>
-        <w:t xml:space="preserve"> </w:t>
-      </w:r>
-      <w:r>
-        <w:t xml:space="preserve">— the</w:t>
-      </w:r>
-      <w:r>
-        <w:t xml:space="preserve"> </w:t>
+        <w:t xml:space="preserve"> — the </w:t>
       </w:r>
       <w:r>
         <w:rPr>
@@ -511,13 +442,7 @@
         <w:t xml:space="preserve">how to implement it on Datadog</w:t>
       </w:r>
       <w:r>
-        <w:t xml:space="preserve"> </w:t>
-      </w:r>
-      <w:r>
-        <w:t xml:space="preserve">companion. Telemetry contract, seven-dashboard pack, SLOs, and a 90-day roadmap. Mapped in</w:t>
-      </w:r>
-      <w:r>
-        <w:t xml:space="preserve"> </w:t>
+        <w:t xml:space="preserve"> companion. Telemetry contract, seven-dashboard pack, SLOs, and a 90-day roadmap. Mapped in </w:t>
       </w:r>
       <w:hyperlink r:id="rId25">
         <w:r>
@@ -528,13 +453,7 @@
         </w:r>
       </w:hyperlink>
       <w:r>
-        <w:t xml:space="preserve"> </w:t>
-      </w:r>
-      <w:r>
-        <w:t xml:space="preserve">and</w:t>
-      </w:r>
-      <w:r>
-        <w:t xml:space="preserve"> </w:t>
+        <w:t xml:space="preserve"> and </w:t>
       </w:r>
       <w:hyperlink r:id="rId26">
         <w:r>
@@ -569,10 +488,7 @@
         <w:t xml:space="preserve">Order Support &amp; Returns Assistant</w:t>
       </w:r>
       <w:r>
-        <w:t xml:space="preserve"> </w:t>
-      </w:r>
-      <w:r>
-        <w:t xml:space="preserve">— an agentic retail customer-service workflow (order status, returns, refunds, loyalty credits, address changes) operating across three storefront brands, over a synthetic 30-day window (1 – 30 June 2026). This scenario was chosen deliberately because it exercises every dimension that matters for a governance-facing demo:</w:t>
+        <w:t xml:space="preserve"> — an agentic retail customer-service workflow (order status, returns, refunds, loyalty credits, address changes) operating across three storefront brands, over a synthetic 30-day window (1 – 30 June 2026). This scenario was chosen deliberately because it exercises every dimension that matters for a governance-facing demo:</w:t>
       </w:r>
     </w:p>
     <w:p>
@@ -590,10 +506,7 @@
         <w:t xml:space="preserve">Cost at scale</w:t>
       </w:r>
       <w:r>
-        <w:t xml:space="preserve"> </w:t>
-      </w:r>
-      <w:r>
-        <w:t xml:space="preserve">— thousands of workflows a month, real token/tool cost economics.</w:t>
+        <w:t xml:space="preserve"> — thousands of workflows a month, real token/tool cost economics.</w:t>
       </w:r>
     </w:p>
     <w:p>
@@ -611,10 +524,7 @@
         <w:t xml:space="preserve">Tool-driven side effects</w:t>
       </w:r>
       <w:r>
-        <w:t xml:space="preserve"> </w:t>
-      </w:r>
-      <w:r>
-        <w:t xml:space="preserve">— refunds move money; this is not a read-only chatbot.</w:t>
+        <w:t xml:space="preserve"> — refunds move money; this is not a read-only chatbot.</w:t>
       </w:r>
     </w:p>
     <w:p>
@@ -632,13 +542,7 @@
         <w:t xml:space="preserve">A believable attack surface</w:t>
       </w:r>
       <w:r>
-        <w:t xml:space="preserve"> </w:t>
-      </w:r>
-      <w:r>
-        <w:t xml:space="preserve">— prompt injection against a</w:t>
-      </w:r>
-      <w:r>
-        <w:t xml:space="preserve"> </w:t>
+        <w:t xml:space="preserve"> — prompt injection against a </w:t>
       </w:r>
       <w:r>
         <w:rPr>
@@ -647,10 +551,7 @@
         <w:t xml:space="preserve">refund_issue</w:t>
       </w:r>
       <w:r>
-        <w:t xml:space="preserve"> </w:t>
-      </w:r>
-      <w:r>
-        <w:t xml:space="preserve">tool is a realistic, high-stakes adversarial scenario, not a contrived one.</w:t>
+        <w:t xml:space="preserve"> tool is a realistic, high-stakes adversarial scenario, not a contrived one.</w:t>
       </w:r>
     </w:p>
     <w:p>
@@ -790,24 +691,18 @@
               <w:t xml:space="preserve">INC-2026-0611</w:t>
             </w:r>
             <w:r>
-              <w:t xml:space="preserve"> </w:t>
-            </w:r>
-            <w:r>
-              <w:t xml:space="preserve">(Sev2)</w:t>
-            </w:r>
-          </w:p>
-        </w:tc>
-        <w:tc>
-          <w:p>
-            <w:pPr>
-              <w:pStyle w:val="Compact"/>
-              <w:jc w:val="left"/>
-            </w:pPr>
-            <w:r>
-              <w:t xml:space="preserve">A cluster of prompt-injection attempts targeting the</w:t>
-            </w:r>
-            <w:r>
-              <w:t xml:space="preserve"> </w:t>
+              <w:t xml:space="preserve"> (Sev2)</w:t>
+            </w:r>
+          </w:p>
+        </w:tc>
+        <w:tc>
+          <w:p>
+            <w:pPr>
+              <w:pStyle w:val="Compact"/>
+              <w:jc w:val="left"/>
+            </w:pPr>
+            <w:r>
+              <w:t xml:space="preserve">A cluster of prompt-injection attempts targeting the </w:t>
             </w:r>
             <w:r>
               <w:rPr>
@@ -816,10 +711,7 @@
               <w:t xml:space="preserve">refund_issue</w:t>
             </w:r>
             <w:r>
-              <w:t xml:space="preserve"> </w:t>
-            </w:r>
-            <w:r>
-              <w:t xml:space="preserve">tool; the guardrail caught 92%, a handful bypassed</w:t>
+              <w:t xml:space="preserve"> tool; the guardrail caught 92%, a handful bypassed</w:t>
             </w:r>
           </w:p>
         </w:tc>
@@ -849,10 +741,7 @@
               <w:t xml:space="preserve">INC-2026-0621</w:t>
             </w:r>
             <w:r>
-              <w:t xml:space="preserve"> </w:t>
-            </w:r>
-            <w:r>
-              <w:t xml:space="preserve">(Sev1)</w:t>
+              <w:t xml:space="preserve"> (Sev1)</w:t>
             </w:r>
           </w:p>
         </w:tc>
@@ -874,25 +763,7 @@
               <w:jc w:val="left"/>
             </w:pPr>
             <w:r>
-              <w:t xml:space="preserve">Mirrors Datadog’s own published finding that provider rate limits are a material share of production LLM failures — this is the</w:t>
-            </w:r>
-            <w:r>
-              <w:t xml:space="preserve"> </w:t>
-            </w:r>
-            <w:r>
-              <w:t xml:space="preserve">“</w:t>
-            </w:r>
-            <w:r>
-              <w:t xml:space="preserve">boring but common</w:t>
-            </w:r>
-            <w:r>
-              <w:t xml:space="preserve">”</w:t>
-            </w:r>
-            <w:r>
-              <w:t xml:space="preserve"> </w:t>
-            </w:r>
-            <w:r>
-              <w:t xml:space="preserve">incident, not a hypothetical</w:t>
+              <w:t>Mirrors Datadog’s own published finding that provider rate limits are a material share of production LLM failures — this is the “boring but common” incident, not a hypothetical</w:t>
             </w:r>
           </w:p>
         </w:tc>
@@ -1113,25 +984,7 @@
       </w:pPr>
       <w:bookmarkStart w:id="30" w:name="what-done-means-for-this-v1"/>
       <w:r>
-        <w:t xml:space="preserve">What</w:t>
-      </w:r>
-      <w:r>
-        <w:t xml:space="preserve"> </w:t>
-      </w:r>
-      <w:r>
-        <w:t xml:space="preserve">“</w:t>
-      </w:r>
-      <w:r>
-        <w:t xml:space="preserve">done</w:t>
-      </w:r>
-      <w:r>
-        <w:t xml:space="preserve">”</w:t>
-      </w:r>
-      <w:r>
-        <w:t xml:space="preserve"> </w:t>
-      </w:r>
-      <w:r>
-        <w:t xml:space="preserve">means for this v1</w:t>
+        <w:t>What “done” means for this v1</w:t>
       </w:r>
       <w:bookmarkEnd w:id="30"/>
     </w:p>
@@ -1140,10 +993,7 @@
         <w:pStyle w:val="FirstParagraph"/>
       </w:pPr>
       <w:r>
-        <w:t xml:space="preserve">All 7 dashboards from the Datadog addendum’s pack are built and populated. The synthetic data pipeline mirrors, field for field, the shape of a real Datadog ingestion pipeline — see</w:t>
-      </w:r>
-      <w:r>
-        <w:t xml:space="preserve"> </w:t>
+        <w:t xml:space="preserve">All 7 dashboards from the Datadog addendum’s pack are built and populated. The synthetic data pipeline mirrors, field for field, the shape of a real Datadog ingestion pipeline — see </w:t>
       </w:r>
       <w:hyperlink r:id="rId31">
         <w:r>
@@ -1154,13 +1004,7 @@
         </w:r>
       </w:hyperlink>
       <w:r>
-        <w:t xml:space="preserve"> </w:t>
-      </w:r>
-      <w:r>
-        <w:t xml:space="preserve">for how to read the dashboards, and</w:t>
-      </w:r>
-      <w:r>
-        <w:t xml:space="preserve"> </w:t>
+        <w:t xml:space="preserve"> for how to read the dashboards, and </w:t>
       </w:r>
       <w:hyperlink r:id="rId32">
         <w:r>
@@ -1171,10 +1015,7 @@
         </w:r>
       </w:hyperlink>
       <w:r>
-        <w:t xml:space="preserve"> </w:t>
-      </w:r>
-      <w:r>
-        <w:t xml:space="preserve">for exactly what is and isn’t modelled honestly in this v1.</w:t>
+        <w:t xml:space="preserve"> for exactly what is and isn’t modelled honestly in this v1.</w:t>
       </w:r>
     </w:p>
     <w:p>
@@ -1198,10 +1039,7 @@
         <w:t xml:space="preserve">Diagram — observability trace-tree architecture</w:t>
       </w:r>
       <w:r>
-        <w:t xml:space="preserve"> </w:t>
-      </w:r>
-      <w:r>
-        <w:t xml:space="preserve">(the principle behind every dashboard):</w:t>
+        <w:t xml:space="preserve"> (the principle behind every dashboard):</w:t>
       </w:r>
     </w:p>
     <w:p>
@@ -1270,10 +1108,7 @@
         <w:t xml:space="preserve">Diagram — demo data flow, synthetic telemetry pipeline</w:t>
       </w:r>
       <w:r>
-        <w:t xml:space="preserve"> </w:t>
-      </w:r>
-      <w:r>
-        <w:t xml:space="preserve">(how the synthetic data is generated and consumed):</w:t>
+        <w:t xml:space="preserve"> (how the synthetic data is generated and consumed):</w:t>
       </w:r>
     </w:p>
     <w:p>
@@ -1405,10 +1240,7 @@
         <w:pStyle w:val="FirstParagraph"/>
       </w:pPr>
       <w:r>
-        <w:t xml:space="preserve">Browsers block</w:t>
-      </w:r>
-      <w:r>
-        <w:t xml:space="preserve"> </w:t>
+        <w:t xml:space="preserve">Browsers block </w:t>
       </w:r>
       <w:r>
         <w:rPr>
@@ -1417,13 +1249,7 @@
         <w:t xml:space="preserve">fetch()</w:t>
       </w:r>
       <w:r>
-        <w:t xml:space="preserve"> </w:t>
-      </w:r>
-      <w:r>
-        <w:t xml:space="preserve">of local JSON over</w:t>
-      </w:r>
-      <w:r>
-        <w:t xml:space="preserve"> </w:t>
+        <w:t xml:space="preserve"> of local JSON over </w:t>
       </w:r>
       <w:r>
         <w:rPr>
@@ -1432,10 +1258,7 @@
         <w:t xml:space="preserve">file://</w:t>
       </w:r>
       <w:r>
-        <w:t xml:space="preserve">, so it must be served (locally, or via GitHub Pages —</w:t>
-      </w:r>
-      <w:r>
-        <w:t xml:space="preserve"> </w:t>
+        <w:t xml:space="preserve">, so it must be served (locally, or via GitHub Pages — </w:t>
       </w:r>
       <w:r>
         <w:rPr>
@@ -1444,10 +1267,7 @@
         <w:t xml:space="preserve">dashboard/</w:t>
       </w:r>
       <w:r>
-        <w:t xml:space="preserve"> </w:t>
-      </w:r>
-      <w:r>
-        <w:t xml:space="preserve">is fully static and Pages-ready). If you want to regenerate the underlying synthetic data first:</w:t>
+        <w:t xml:space="preserve"> is fully static and Pages-ready). If you want to regenerate the underlying synthetic data first:</w:t>
       </w:r>
     </w:p>
     <w:p>
@@ -1502,34 +1322,16 @@
         <w:pStyle w:val="FirstParagraph"/>
       </w:pPr>
       <w:r>
-        <w:t xml:space="preserve">Every screen carries a</w:t>
-      </w:r>
-      <w:r>
-        <w:t xml:space="preserve"> </w:t>
+        <w:t xml:space="preserve">Every screen carries a </w:t>
       </w:r>
       <w:r>
         <w:rPr>
           <w:b/>
         </w:rPr>
-        <w:t xml:space="preserve">“</w:t>
-      </w:r>
-      <w:r>
-        <w:rPr>
-          <w:b/>
-        </w:rPr>
-        <w:t xml:space="preserve">MOCK / SYNTHETIC DATA</w:t>
-      </w:r>
-      <w:r>
-        <w:rPr>
-          <w:b/>
-        </w:rPr>
-        <w:t xml:space="preserve">”</w:t>
-      </w:r>
-      <w:r>
-        <w:t xml:space="preserve"> </w:t>
-      </w:r>
-      <w:r>
-        <w:t xml:space="preserve">pill in the header — keep that visible in any live demo or screen-share; it’s the honesty mechanism that makes this useful in a governance conversation rather than misleading in one.</w:t>
+        <w:t>“MOCK / SYNTHETIC DATA”</w:t>
+      </w:r>
+      <w:r>
+        <w:t xml:space="preserve"> pill in the header — keep that visible in any live demo or screen-share; it’s the honesty mechanism that makes this useful in a governance conversation rather than misleading in one.</w:t>
       </w:r>
     </w:p>
     <w:p>
@@ -1547,10 +1349,7 @@
         <w:pStyle w:val="FirstParagraph"/>
       </w:pPr>
       <w:r>
-        <w:t xml:space="preserve">Seven tabs across the top, one per dashboard in the addendum’s pack. All read from a single pre-aggregated file,</w:t>
-      </w:r>
-      <w:r>
-        <w:t xml:space="preserve"> </w:t>
+        <w:t xml:space="preserve">Seven tabs across the top, one per dashboard in the addendum’s pack. All read from a single pre-aggregated file, </w:t>
       </w:r>
       <w:r>
         <w:rPr>
@@ -1568,10 +1367,7 @@
         <w:t xml:space="preserve">data/synthetic/raw/*.csv</w:t>
       </w:r>
       <w:r>
-        <w:t xml:space="preserve">) by the aggregator script. See the</w:t>
-      </w:r>
-      <w:r>
-        <w:t xml:space="preserve"> </w:t>
+        <w:t xml:space="preserve">) by the aggregator script. See the </w:t>
       </w:r>
       <w:hyperlink r:id="rId39">
         <w:r>
@@ -1582,10 +1378,7 @@
         </w:r>
       </w:hyperlink>
       <w:r>
-        <w:t xml:space="preserve"> </w:t>
-      </w:r>
-      <w:r>
-        <w:t xml:space="preserve">below for how the seven map to audiences.</w:t>
+        <w:t xml:space="preserve"> below for how the seven map to audiences.</w:t>
       </w:r>
     </w:p>
     <w:p>
@@ -1642,10 +1435,7 @@
         <w:t xml:space="preserve">Daily workflow volume by outcome</w:t>
       </w:r>
       <w:r>
-        <w:t xml:space="preserve"> </w:t>
-      </w:r>
-      <w:r>
-        <w:t xml:space="preserve">— resolved / failed / escalated / blocked, stacked by day.</w:t>
+        <w:t xml:space="preserve"> — resolved / failed / escalated / blocked, stacked by day.</w:t>
       </w:r>
     </w:p>
     <w:p>
@@ -1663,10 +1453,7 @@
         <w:t xml:space="preserve">Success rate (%) — daily trend</w:t>
       </w:r>
       <w:r>
-        <w:t xml:space="preserve"> </w:t>
-      </w:r>
-      <w:r>
-        <w:t xml:space="preserve">— watch for dips around the two seeded incidents.</w:t>
+        <w:t xml:space="preserve"> — watch for dips around the two seeded incidents.</w:t>
       </w:r>
     </w:p>
     <w:p>
@@ -1684,10 +1471,7 @@
         <w:t xml:space="preserve">Cost per successful workflow (USD) — daily trend</w:t>
       </w:r>
       <w:r>
-        <w:t xml:space="preserve"> </w:t>
-      </w:r>
-      <w:r>
-        <w:t xml:space="preserve">— the single number a CFO will ask about first.</w:t>
+        <w:t xml:space="preserve"> — the single number a CFO will ask about first.</w:t>
       </w:r>
     </w:p>
     <w:p>
@@ -1705,10 +1489,7 @@
         <w:t xml:space="preserve">Workflow volume by tenant (brand)</w:t>
       </w:r>
       <w:r>
-        <w:t xml:space="preserve"> </w:t>
-      </w:r>
-      <w:r>
-        <w:t xml:space="preserve">— adoption across the three storefront brands.</w:t>
+        <w:t xml:space="preserve"> — adoption across the three storefront brands.</w:t>
       </w:r>
     </w:p>
     <w:p>
@@ -1726,10 +1507,7 @@
         <w:t xml:space="preserve">Cost composition — 30-day total by category</w:t>
       </w:r>
       <w:r>
-        <w:t xml:space="preserve"> </w:t>
-      </w:r>
-      <w:r>
-        <w:t xml:space="preserve">— LLM vs. tool vs. retrieval cost.</w:t>
+        <w:t xml:space="preserve"> — LLM vs. tool vs. retrieval cost.</w:t>
       </w:r>
     </w:p>
     <w:p>
@@ -1747,10 +1525,7 @@
         <w:t xml:space="preserve">Incident log (Sev1/Sev2)</w:t>
       </w:r>
       <w:r>
-        <w:t xml:space="preserve"> </w:t>
-      </w:r>
-      <w:r>
-        <w:t xml:space="preserve">— the two seeded incidents, in a format a risk committee would expect to see.</w:t>
+        <w:t xml:space="preserve"> — the two seeded incidents, in a format a risk committee would expect to see.</w:t>
       </w:r>
     </w:p>
     <w:p>
@@ -1764,10 +1539,7 @@
         <w:t xml:space="preserve">How to present it:</w:t>
       </w:r>
       <w:r>
-        <w:t xml:space="preserve"> </w:t>
-      </w:r>
-      <w:r>
-        <w:t xml:space="preserve">this is the tab for a 2-minute exec walkthrough — lead with cost avoidance and success rate, point at the incident log to show detection is working, and stop there unless asked to go deeper.</w:t>
+        <w:t xml:space="preserve"> this is the tab for a 2-minute exec walkthrough — lead with cost avoidance and success rate, point at the incident log to show detection is working, and stop there unless asked to go deeper.</w:t>
       </w:r>
     </w:p>
     <w:p>
@@ -1806,10 +1578,7 @@
         <w:t xml:space="preserve">Latency by layer (P95, ms)</w:t>
       </w:r>
       <w:r>
-        <w:t xml:space="preserve"> </w:t>
-      </w:r>
-      <w:r>
-        <w:t xml:space="preserve">— decomposes end-to-end latency into model / retrieval / tool time, so an on-call engineer knows where to look first.</w:t>
+        <w:t xml:space="preserve"> — decomposes end-to-end latency into model / retrieval / tool time, so an on-call engineer knows where to look first.</w:t>
       </w:r>
     </w:p>
     <w:p>
@@ -1827,13 +1596,7 @@
         <w:t xml:space="preserve">P50/P95/P99 latency trend</w:t>
       </w:r>
       <w:r>
-        <w:t xml:space="preserve"> </w:t>
-      </w:r>
-      <w:r>
-        <w:t xml:space="preserve">and</w:t>
-      </w:r>
-      <w:r>
-        <w:t xml:space="preserve"> </w:t>
+        <w:t xml:space="preserve"> and </w:t>
       </w:r>
       <w:r>
         <w:rPr>
@@ -1860,10 +1623,7 @@
         <w:t xml:space="preserve">Provider rate-limit events — daily</w:t>
       </w:r>
       <w:r>
-        <w:t xml:space="preserve"> </w:t>
-      </w:r>
-      <w:r>
-        <w:t xml:space="preserve">— this is where INC-2026-0621 (the Sev1) shows up as a spike.</w:t>
+        <w:t xml:space="preserve"> — this is where INC-2026-0621 (the Sev1) shows up as a spike.</w:t>
       </w:r>
     </w:p>
     <w:p>
@@ -1881,10 +1641,7 @@
         <w:t xml:space="preserve">Agent loop events — daily</w:t>
       </w:r>
       <w:r>
-        <w:t xml:space="preserve"> </w:t>
-      </w:r>
-      <w:r>
-        <w:t xml:space="preserve">— repeated tool-call sequences; a leading indicator of runaway agent behaviour.</w:t>
+        <w:t xml:space="preserve"> — repeated tool-call sequences; a leading indicator of runaway agent behaviour.</w:t>
       </w:r>
     </w:p>
     <w:p>
@@ -1902,10 +1659,7 @@
         <w:t xml:space="preserve">Representative trace waterfall</w:t>
       </w:r>
       <w:r>
-        <w:t xml:space="preserve"> </w:t>
-      </w:r>
-      <w:r>
-        <w:t xml:space="preserve">— a single illustrative trace, decomposed into guardrail → retrieval → model (with a rate-limited retry + provider fallback) → tool steps. This is the closest thing in the static demo to a real APM/LLM-observability trace view.</w:t>
+        <w:t xml:space="preserve"> — a single illustrative trace, decomposed into guardrail → retrieval → model (with a rate-limited retry + provider fallback) → tool steps. This is the closest thing in the static demo to a real APM/LLM-observability trace view.</w:t>
       </w:r>
     </w:p>
     <w:p>
@@ -1944,10 +1698,7 @@
         <w:t xml:space="preserve">Prompt injection attempts — blocked vs. bypassed (daily)</w:t>
       </w:r>
       <w:r>
-        <w:t xml:space="preserve"> </w:t>
-      </w:r>
-      <w:r>
-        <w:t xml:space="preserve">— this is where INC-2026-0611 shows up: a visible cluster of attempts, with the bypass count exposed rather than buried.</w:t>
+        <w:t xml:space="preserve"> — this is where INC-2026-0611 shows up: a visible cluster of attempts, with the bypass count exposed rather than buried.</w:t>
       </w:r>
     </w:p>
     <w:p>
@@ -1995,10 +1746,7 @@
         <w:t xml:space="preserve">Incident spotlight — INC-2026-0611</w:t>
       </w:r>
       <w:r>
-        <w:t xml:space="preserve"> </w:t>
-      </w:r>
-      <w:r>
-        <w:t xml:space="preserve">— a narrative callout box walking through what happened, detection, and mitigation.</w:t>
+        <w:t xml:space="preserve"> — a narrative callout box walking through what happened, detection, and mitigation.</w:t>
       </w:r>
     </w:p>
     <w:p>
@@ -2012,46 +1760,7 @@
         <w:t xml:space="preserve">Why this tab matters most for a risk committee:</w:t>
       </w:r>
       <w:r>
-        <w:t xml:space="preserve"> </w:t>
-      </w:r>
-      <w:r>
-        <w:t xml:space="preserve">it’s the one place a</w:t>
-      </w:r>
-      <w:r>
-        <w:t xml:space="preserve"> </w:t>
-      </w:r>
-      <w:r>
-        <w:t xml:space="preserve">“</w:t>
-      </w:r>
-      <w:r>
-        <w:t xml:space="preserve">successful</w:t>
-      </w:r>
-      <w:r>
-        <w:t xml:space="preserve">”</w:t>
-      </w:r>
-      <w:r>
-        <w:t xml:space="preserve"> </w:t>
-      </w:r>
-      <w:r>
-        <w:t xml:space="preserve">workflow (agent responded, no application error) and a</w:t>
-      </w:r>
-      <w:r>
-        <w:t xml:space="preserve"> </w:t>
-      </w:r>
-      <w:r>
-        <w:t xml:space="preserve">“</w:t>
-      </w:r>
-      <w:r>
-        <w:t xml:space="preserve">safe</w:t>
-      </w:r>
-      <w:r>
-        <w:t xml:space="preserve">”</w:t>
-      </w:r>
-      <w:r>
-        <w:t xml:space="preserve"> </w:t>
-      </w:r>
-      <w:r>
-        <w:t xml:space="preserve">workflow are shown as two different things.</w:t>
+        <w:t xml:space="preserve"> it’s the one place a “successful” workflow (agent responded, no application error) and a “safe” workflow are shown as two different things.</w:t>
       </w:r>
     </w:p>
     <w:p>
@@ -2120,10 +1829,7 @@
         <w:t xml:space="preserve">Provider quota utilisation (%)</w:t>
       </w:r>
       <w:r>
-        <w:t xml:space="preserve"> </w:t>
-      </w:r>
-      <w:r>
-        <w:t xml:space="preserve">against an assumed daily LLM-call quota — the promo-driven rate-limit incident (days 21–22) shows up here as a quota breach.</w:t>
+        <w:t xml:space="preserve"> against an assumed daily LLM-call quota — the promo-driven rate-limit incident (days 21–22) shows up here as a quota breach.</w:t>
       </w:r>
     </w:p>
     <w:p>
@@ -2141,10 +1847,7 @@
         <w:t xml:space="preserve">Cumulative cost vs. monthly budget</w:t>
       </w:r>
       <w:r>
-        <w:t xml:space="preserve"> </w:t>
-      </w:r>
-      <w:r>
-        <w:t xml:space="preserve">— a budget-burn line.</w:t>
+        <w:t xml:space="preserve"> — a budget-burn line.</w:t>
       </w:r>
     </w:p>
     <w:p>
@@ -2162,40 +1865,7 @@
         <w:t xml:space="preserve">Fallback-model cost uplift (daily, USD)</w:t>
       </w:r>
       <w:r>
-        <w:t xml:space="preserve"> </w:t>
-      </w:r>
-      <w:r>
-        <w:t xml:space="preserve">— the direct dollar cost of routing to a more expensive fallback model during the rate-limit incident; this is the number that turns</w:t>
-      </w:r>
-      <w:r>
-        <w:t xml:space="preserve"> </w:t>
-      </w:r>
-      <w:r>
-        <w:t xml:space="preserve">“</w:t>
-      </w:r>
-      <w:r>
-        <w:t xml:space="preserve">we had an outage</w:t>
-      </w:r>
-      <w:r>
-        <w:t xml:space="preserve">”</w:t>
-      </w:r>
-      <w:r>
-        <w:t xml:space="preserve"> </w:t>
-      </w:r>
-      <w:r>
-        <w:t xml:space="preserve">into</w:t>
-      </w:r>
-      <w:r>
-        <w:t xml:space="preserve"> </w:t>
-      </w:r>
-      <w:r>
-        <w:t xml:space="preserve">“</w:t>
-      </w:r>
-      <w:r>
-        <w:t xml:space="preserve">the outage cost us $X.</w:t>
-      </w:r>
-      <w:r>
-        <w:t xml:space="preserve">”</w:t>
+        <w:t xml:space="preserve"> — the direct dollar cost of routing to a more expensive fallback model during the rate-limit incident; this is the number that turns “we had an outage” into “the outage cost us $X.”</w:t>
       </w:r>
     </w:p>
     <w:p>
@@ -2234,10 +1904,7 @@
         <w:t xml:space="preserve">Average step count / tool calls per workflow — daily</w:t>
       </w:r>
       <w:r>
-        <w:t xml:space="preserve"> </w:t>
-      </w:r>
-      <w:r>
-        <w:t xml:space="preserve">— a proxy for agent efficiency and scope creep.</w:t>
+        <w:t xml:space="preserve"> — a proxy for agent efficiency and scope creep.</w:t>
       </w:r>
     </w:p>
     <w:p>
@@ -2255,10 +1922,7 @@
         <w:t xml:space="preserve">Tool calls by name (30-day total)</w:t>
       </w:r>
       <w:r>
-        <w:t xml:space="preserve"> </w:t>
-      </w:r>
-      <w:r>
-        <w:t xml:space="preserve">— which tools the agent actually uses.</w:t>
+        <w:t xml:space="preserve"> — which tools the agent actually uses.</w:t>
       </w:r>
     </w:p>
     <w:p>
@@ -2276,10 +1940,7 @@
         <w:t xml:space="preserve">Human escalation rate (%) — daily</w:t>
       </w:r>
       <w:r>
-        <w:t xml:space="preserve"> </w:t>
-      </w:r>
-      <w:r>
-        <w:t xml:space="preserve">— the automation boundary in practice.</w:t>
+        <w:t xml:space="preserve"> — the automation boundary in practice.</w:t>
       </w:r>
     </w:p>
     <w:p>
@@ -2297,13 +1958,7 @@
         <w:t xml:space="preserve">Tool call success rate (%)</w:t>
       </w:r>
       <w:r>
-        <w:t xml:space="preserve"> </w:t>
-      </w:r>
-      <w:r>
-        <w:t xml:space="preserve">— used here as a</w:t>
-      </w:r>
-      <w:r>
-        <w:t xml:space="preserve"> </w:t>
+        <w:t xml:space="preserve"> — used here as a </w:t>
       </w:r>
       <w:r>
         <w:rPr>
@@ -2312,28 +1967,7 @@
         <w:t xml:space="preserve">proxy</w:t>
       </w:r>
       <w:r>
-        <w:t xml:space="preserve"> </w:t>
-      </w:r>
-      <w:r>
-        <w:t xml:space="preserve">for tool-selection quality, since this demo doesn’t model ground-truth</w:t>
-      </w:r>
-      <w:r>
-        <w:t xml:space="preserve"> </w:t>
-      </w:r>
-      <w:r>
-        <w:t xml:space="preserve">“</w:t>
-      </w:r>
-      <w:r>
-        <w:t xml:space="preserve">correct tool for intent</w:t>
-      </w:r>
-      <w:r>
-        <w:t xml:space="preserve">”</w:t>
-      </w:r>
-      <w:r>
-        <w:t xml:space="preserve"> </w:t>
-      </w:r>
-      <w:r>
-        <w:t xml:space="preserve">labelling. Call this out explicitly if presenting to an audience that will ask for a real accuracy number.</w:t>
+        <w:t xml:space="preserve"> for tool-selection quality, since this demo doesn’t model ground-truth “correct tool for intent” labelling. Call this out explicitly if presenting to an audience that will ask for a real accuracy number.</w:t>
       </w:r>
     </w:p>
     <w:p>
@@ -2402,13 +2036,7 @@
         <w:t xml:space="preserve">Hallucination rate (%)</w:t>
       </w:r>
       <w:r>
-        <w:t xml:space="preserve"> </w:t>
-      </w:r>
-      <w:r>
-        <w:t xml:space="preserve">and</w:t>
-      </w:r>
-      <w:r>
-        <w:t xml:space="preserve"> </w:t>
+        <w:t xml:space="preserve"> and </w:t>
       </w:r>
       <w:r>
         <w:rPr>
@@ -2443,13 +2071,7 @@
         <w:t xml:space="preserve">Read the fine print here.</w:t>
       </w:r>
       <w:r>
-        <w:t xml:space="preserve"> </w:t>
-      </w:r>
-      <w:r>
-        <w:t xml:space="preserve">Groundedness, citation accuracy, hallucination rate and abstention rate are generated as a</w:t>
-      </w:r>
-      <w:r>
-        <w:t xml:space="preserve"> </w:t>
+        <w:t xml:space="preserve"> Groundedness, citation accuracy, hallucination rate and abstention rate are generated as a </w:t>
       </w:r>
       <w:r>
         <w:rPr>
@@ -2458,13 +2080,7 @@
         <w:t xml:space="preserve">synthetic evaluation-harness series</w:t>
       </w:r>
       <w:r>
-        <w:t xml:space="preserve"> </w:t>
-      </w:r>
-      <w:r>
-        <w:t xml:space="preserve">— independent of the raw retrieval/model spans — because that’s how a real implementation works too: evals run on a schedule against sampled traffic, scored by an LLM-as-judge or human reviewer, not computed inline on every request. See</w:t>
-      </w:r>
-      <w:r>
-        <w:t xml:space="preserve"> </w:t>
+        <w:t xml:space="preserve"> — independent of the raw retrieval/model spans — because that’s how a real implementation works too: evals run on a schedule against sampled traffic, scored by an LLM-as-judge or human reviewer, not computed inline on every request. See </w:t>
       </w:r>
       <w:hyperlink r:id="rId32">
         <w:r>
@@ -2475,10 +2091,7 @@
         </w:r>
       </w:hyperlink>
       <w:r>
-        <w:t xml:space="preserve"> </w:t>
-      </w:r>
-      <w:r>
-        <w:t xml:space="preserve">for why this is a deliberate design choice, not a shortcut being passed off as something else.</w:t>
+        <w:t xml:space="preserve"> for why this is a deliberate design choice, not a shortcut being passed off as something else.</w:t>
       </w:r>
     </w:p>
     <w:p>
@@ -2532,10 +2145,7 @@
         <w:t xml:space="preserve">Release / rollback log</w:t>
       </w:r>
       <w:r>
-        <w:t xml:space="preserve"> </w:t>
-      </w:r>
-      <w:r>
-        <w:t xml:space="preserve">— this is where the seeded prompt v14 → v15 regression and rollback (REL-2026-0608 / REL-2026-0609) appears as a concrete row, not an abstraction.</w:t>
+        <w:t xml:space="preserve"> — this is where the seeded prompt v14 → v15 regression and rollback (REL-2026-0608 / REL-2026-0609) appears as a concrete row, not an abstraction.</w:t>
       </w:r>
     </w:p>
     <w:p>
@@ -2571,10 +2181,7 @@
         <w:pStyle w:val="Compact"/>
       </w:pPr>
       <w:r>
-        <w:t xml:space="preserve">Start on</w:t>
-      </w:r>
-      <w:r>
-        <w:t xml:space="preserve"> </w:t>
+        <w:t xml:space="preserve">Start on </w:t>
       </w:r>
       <w:r>
         <w:rPr>
@@ -2583,10 +2190,7 @@
         <w:t xml:space="preserve">Executive AI Health</w:t>
       </w:r>
       <w:r>
-        <w:t xml:space="preserve"> </w:t>
-      </w:r>
-      <w:r>
-        <w:t xml:space="preserve">to set business context and headline numbers.</w:t>
+        <w:t xml:space="preserve"> to set business context and headline numbers.</w:t>
       </w:r>
     </w:p>
     <w:p>
@@ -2598,10 +2202,7 @@
         <w:pStyle w:val="Compact"/>
       </w:pPr>
       <w:r>
-        <w:t xml:space="preserve">Jump to</w:t>
-      </w:r>
-      <w:r>
-        <w:t xml:space="preserve"> </w:t>
+        <w:t xml:space="preserve">Jump to </w:t>
       </w:r>
       <w:r>
         <w:rPr>
@@ -2622,10 +2223,7 @@
         <w:pStyle w:val="Compact"/>
       </w:pPr>
       <w:r>
-        <w:t xml:space="preserve">Show</w:t>
-      </w:r>
-      <w:r>
-        <w:t xml:space="preserve"> </w:t>
+        <w:t xml:space="preserve">Show </w:t>
       </w:r>
       <w:r>
         <w:rPr>
@@ -2634,25 +2232,7 @@
         <w:t xml:space="preserve">Engineering Operations</w:t>
       </w:r>
       <w:r>
-        <w:t xml:space="preserve">, specifically the trace waterfall, to ground the abstract</w:t>
-      </w:r>
-      <w:r>
-        <w:t xml:space="preserve"> </w:t>
-      </w:r>
-      <w:r>
-        <w:t xml:space="preserve">“</w:t>
-      </w:r>
-      <w:r>
-        <w:t xml:space="preserve">trace tree</w:t>
-      </w:r>
-      <w:r>
-        <w:t xml:space="preserve">”</w:t>
-      </w:r>
-      <w:r>
-        <w:t xml:space="preserve"> </w:t>
-      </w:r>
-      <w:r>
-        <w:t xml:space="preserve">concept in a concrete picture.</w:t>
+        <w:t>, specifically the trace waterfall, to ground the abstract “trace tree” concept in a concrete picture.</w:t>
       </w:r>
     </w:p>
     <w:p>
@@ -2664,10 +2244,7 @@
         <w:pStyle w:val="Compact"/>
       </w:pPr>
       <w:r>
-        <w:t xml:space="preserve">Show</w:t>
-      </w:r>
-      <w:r>
-        <w:t xml:space="preserve"> </w:t>
+        <w:t xml:space="preserve">Show </w:t>
       </w:r>
       <w:r>
         <w:rPr>
@@ -2676,10 +2253,7 @@
         <w:t xml:space="preserve">Cost &amp; Capacity</w:t>
       </w:r>
       <w:r>
-        <w:t xml:space="preserve"> </w:t>
-      </w:r>
-      <w:r>
-        <w:t xml:space="preserve">to connect the rate-limit incident to a dollar figure.</w:t>
+        <w:t xml:space="preserve"> to connect the rate-limit incident to a dollar figure.</w:t>
       </w:r>
     </w:p>
     <w:p>
@@ -2691,10 +2265,7 @@
         <w:pStyle w:val="Compact"/>
       </w:pPr>
       <w:r>
-        <w:t xml:space="preserve">Close on</w:t>
-      </w:r>
-      <w:r>
-        <w:t xml:space="preserve"> </w:t>
+        <w:t xml:space="preserve">Close on </w:t>
       </w:r>
       <w:r>
         <w:rPr>
@@ -2703,13 +2274,7 @@
         <w:t xml:space="preserve">RAG &amp; Grounding</w:t>
       </w:r>
       <w:r>
-        <w:t xml:space="preserve"> </w:t>
-      </w:r>
-      <w:r>
-        <w:t xml:space="preserve">or</w:t>
-      </w:r>
-      <w:r>
-        <w:t xml:space="preserve"> </w:t>
+        <w:t xml:space="preserve"> or </w:t>
       </w:r>
       <w:r>
         <w:rPr>
@@ -2742,10 +2307,7 @@
         <w:t xml:space="preserve">Diagram — dashboard information architecture</w:t>
       </w:r>
       <w:r>
-        <w:t xml:space="preserve"> </w:t>
-      </w:r>
-      <w:r>
-        <w:t xml:space="preserve">(7 dashboards, 7 audiences, one common trace-tree source of truth):</w:t>
+        <w:t xml:space="preserve"> (7 dashboards, 7 audiences, one common trace-tree source of truth):</w:t>
       </w:r>
     </w:p>
     <w:p>
@@ -2836,10 +2398,7 @@
         <w:pStyle w:val="FirstParagraph"/>
       </w:pPr>
       <w:r>
-        <w:t xml:space="preserve">Per the metrics catalogue’s architectural principle, every workflow is instrumented as</w:t>
-      </w:r>
-      <w:r>
-        <w:t xml:space="preserve"> </w:t>
+        <w:t xml:space="preserve">Per the metrics catalogue’s architectural principle, every workflow is instrumented as </w:t>
       </w:r>
       <w:r>
         <w:rPr>
@@ -2848,10 +2407,7 @@
         <w:t xml:space="preserve">one connected trace tree</w:t>
       </w:r>
       <w:r>
-        <w:t xml:space="preserve">: user request → policy checks → context assembly → retrieval → planning → model calls → tool calls → evaluator checks → human approvals → final outcome. See the</w:t>
-      </w:r>
-      <w:r>
-        <w:t xml:space="preserve"> </w:t>
+        <w:t xml:space="preserve">: user request → policy checks → context assembly → retrieval → planning → model calls → tool calls → evaluator checks → human approvals → final outcome. See the </w:t>
       </w:r>
       <w:hyperlink r:id="rId52">
         <w:r>
@@ -2862,10 +2418,7 @@
         </w:r>
       </w:hyperlink>
       <w:r>
-        <w:t xml:space="preserve"> </w:t>
-      </w:r>
-      <w:r>
-        <w:t xml:space="preserve">below.</w:t>
+        <w:t xml:space="preserve"> below.</w:t>
       </w:r>
     </w:p>
     <w:p>
@@ -2873,10 +2426,7 @@
         <w:pStyle w:val="BodyText"/>
       </w:pPr>
       <w:r>
-        <w:t xml:space="preserve">This single choice is what makes cross-dimensional correlation possible — the same</w:t>
-      </w:r>
-      <w:r>
-        <w:t xml:space="preserve"> </w:t>
+        <w:t xml:space="preserve">This single choice is what makes cross-dimensional correlation possible — the same </w:t>
       </w:r>
       <w:r>
         <w:rPr>
@@ -2885,10 +2435,7 @@
         <w:t xml:space="preserve">workflow_id</w:t>
       </w:r>
       <w:r>
-        <w:t xml:space="preserve"> </w:t>
-      </w:r>
-      <w:r>
-        <w:t xml:space="preserve">that shows up as a cost line in the Executive tab is the same trace that shows a policy bypass in the Security tab. Isolated logs cannot do this; a trace tree can.</w:t>
+        <w:t xml:space="preserve"> that shows up as a cost line in the Executive tab is the same trace that shows a policy bypass in the Security tab. Isolated logs cannot do this; a trace tree can.</w:t>
       </w:r>
     </w:p>
     <w:p>
@@ -2906,10 +2453,7 @@
         <w:pStyle w:val="FirstParagraph"/>
       </w:pPr>
       <w:r>
-        <w:t xml:space="preserve">Per the addendum:</w:t>
-      </w:r>
-      <w:r>
-        <w:t xml:space="preserve"> </w:t>
+        <w:t xml:space="preserve">Per the addendum: </w:t>
       </w:r>
       <w:r>
         <w:rPr>
@@ -2918,13 +2462,7 @@
         <w:t xml:space="preserve">Datadog is the production observability/control plane, not the policy authority.</w:t>
       </w:r>
       <w:r>
-        <w:t xml:space="preserve"> </w:t>
-      </w:r>
-      <w:r>
-        <w:t xml:space="preserve">Policy ownership stays with architecture, security, data governance and responsible-AI risk functions. This demo mirrors that split deliberately — the synthetic guardrail spans record policy</w:t>
-      </w:r>
-      <w:r>
-        <w:t xml:space="preserve"> </w:t>
+        <w:t xml:space="preserve"> Policy ownership stays with architecture, security, data governance and responsible-AI risk functions. This demo mirrors that split deliberately — the synthetic guardrail spans record policy </w:t>
       </w:r>
       <w:r>
         <w:rPr>
@@ -2933,10 +2471,7 @@
         <w:t xml:space="preserve">decisions</w:t>
       </w:r>
       <w:r>
-        <w:t xml:space="preserve"> </w:t>
-      </w:r>
-      <w:r>
-        <w:t xml:space="preserve">(allow/block/escalate), they do not implement policy. That distinction matters in governance conversations: buying an observability tool does not discharge the accountability for setting the policy in the first place.</w:t>
+        <w:t xml:space="preserve"> (allow/block/escalate), they do not implement policy. That distinction matters in governance conversations: buying an observability tool does not discharge the accountability for setting the policy in the first place.</w:t>
       </w:r>
     </w:p>
     <w:p>
@@ -2954,10 +2489,7 @@
         <w:pStyle w:val="FirstParagraph"/>
       </w:pPr>
       <w:r>
-        <w:t xml:space="preserve">Groundedness, citation accuracy, hallucination rate, abstention rate, regression pass rate and golden-set accuracy are all present in the RAG and Release dashboards. They are generated as a</w:t>
-      </w:r>
-      <w:r>
-        <w:t xml:space="preserve"> </w:t>
+        <w:t xml:space="preserve">Groundedness, citation accuracy, hallucination rate, abstention rate, regression pass rate and golden-set accuracy are all present in the RAG and Release dashboards. They are generated as a </w:t>
       </w:r>
       <w:r>
         <w:rPr>
@@ -2966,10 +2498,7 @@
         <w:t xml:space="preserve">synthetic daily series</w:t>
       </w:r>
       <w:r>
-        <w:t xml:space="preserve">, independent of the raw workflow/LLM/tool/retrieval spans — this is deliberate, and it mirrors exactly how a real implementation has to work: evals run on a schedule against sampled traffic (an LLM-as-judge pipeline, golden sets, human review sampling), not inline on every request. Present this as an honest architectural point, not a hidden shortcut:</w:t>
-      </w:r>
-      <w:r>
-        <w:t xml:space="preserve"> </w:t>
+        <w:t xml:space="preserve">, independent of the raw workflow/LLM/tool/retrieval spans — this is deliberate, and it mirrors exactly how a real implementation has to work: evals run on a schedule against sampled traffic (an LLM-as-judge pipeline, golden sets, human review sampling), not inline on every request. Present this as an honest architectural point, not a hidden shortcut: </w:t>
       </w:r>
       <w:r>
         <w:rPr>
@@ -2978,10 +2507,7 @@
         <w:t xml:space="preserve">a real eval harness is still required to produce these numbers for real</w:t>
       </w:r>
       <w:r>
-        <w:t xml:space="preserve"> </w:t>
-      </w:r>
-      <w:r>
-        <w:t xml:space="preserve">(scoped into Weeks 7–10 of the roadmap).</w:t>
+        <w:t xml:space="preserve"> (scoped into Weeks 7–10 of the roadmap).</w:t>
       </w:r>
     </w:p>
     <w:p>
@@ -3126,10 +2652,7 @@
               <w:jc w:val="left"/>
             </w:pPr>
             <w:r>
-              <w:t xml:space="preserve">Flagged in</w:t>
-            </w:r>
-            <w:r>
-              <w:t xml:space="preserve"> </w:t>
+              <w:t xml:space="preserve">Flagged in </w:t>
             </w:r>
             <w:r>
               <w:rPr>
@@ -3232,10 +2755,7 @@
               <w:jc w:val="left"/>
             </w:pPr>
             <w:r>
-              <w:t xml:space="preserve">Only modelled via tool</w:t>
-            </w:r>
-            <w:r>
-              <w:t xml:space="preserve"> </w:t>
+              <w:t xml:space="preserve">Only modelled via tool </w:t>
             </w:r>
             <w:r>
               <w:rPr>
@@ -3302,22 +2822,7 @@
         <w:t xml:space="preserve">Don’t overstate Datadog’s market position.</w:t>
       </w:r>
       <w:r>
-        <w:t xml:space="preserve"> </w:t>
-      </w:r>
-      <w:r>
-        <w:t xml:space="preserve">Cite only what’s evidenced (supported providers/frameworks) — not</w:t>
-      </w:r>
-      <w:r>
-        <w:t xml:space="preserve"> </w:t>
-      </w:r>
-      <w:r>
-        <w:t xml:space="preserve">“</w:t>
-      </w:r>
-      <w:r>
-        <w:t xml:space="preserve">used by every frontier lab.</w:t>
-      </w:r>
-      <w:r>
-        <w:t xml:space="preserve">”</w:t>
+        <w:t xml:space="preserve"> Cite only what’s evidenced (supported providers/frameworks) — not “used by every frontier lab.”</w:t>
       </w:r>
     </w:p>
     <w:p>
@@ -3335,10 +2840,7 @@
         <w:t xml:space="preserve">Observability ≠ governance.</w:t>
       </w:r>
       <w:r>
-        <w:t xml:space="preserve"> </w:t>
-      </w:r>
-      <w:r>
-        <w:t xml:space="preserve">Datadog operationalises controls; policy ownership stays with security/governance/risk/product, not the tooling vendor.</w:t>
+        <w:t xml:space="preserve"> Datadog operationalises controls; policy ownership stays with security/governance/risk/product, not the tooling vendor.</w:t>
       </w:r>
     </w:p>
     <w:p>
@@ -3356,13 +2858,7 @@
         <w:t xml:space="preserve">Prompt/output logging is a privacy decision, not a default.</w:t>
       </w:r>
       <w:r>
-        <w:t xml:space="preserve"> </w:t>
-      </w:r>
-      <w:r>
-        <w:t xml:space="preserve">Apply redaction, hashing, classification and retention classes by risk tier</w:t>
-      </w:r>
-      <w:r>
-        <w:t xml:space="preserve"> </w:t>
+        <w:t xml:space="preserve"> Apply redaction, hashing, classification and retention classes by risk tier </w:t>
       </w:r>
       <w:r>
         <w:rPr>
@@ -3371,10 +2867,7 @@
         <w:t xml:space="preserve">before</w:t>
       </w:r>
       <w:r>
-        <w:t xml:space="preserve"> </w:t>
-      </w:r>
-      <w:r>
-        <w:t xml:space="preserve">logging real content — this needs to be decided before instrumenting live traffic, not after.</w:t>
+        <w:t xml:space="preserve"> logging real content — this needs to be decided before instrumenting live traffic, not after.</w:t>
       </w:r>
     </w:p>
     <w:p>
@@ -3392,10 +2885,7 @@
         <w:t xml:space="preserve">Standardise tags before scaling.</w:t>
       </w:r>
       <w:r>
-        <w:t xml:space="preserve"> </w:t>
-      </w:r>
-      <w:r>
-        <w:t xml:space="preserve">High-cardinality raw IDs as primary dimensions get expensive and noisy fast; agree the tag taxonomy in Weeks 0–2, not retrofit it later.</w:t>
+        <w:t xml:space="preserve"> High-cardinality raw IDs as primary dimensions get expensive and noisy fast; agree the tag taxonomy in Weeks 0–2, not retrofit it later.</w:t>
       </w:r>
     </w:p>
     <w:p>
@@ -3413,10 +2903,7 @@
         <w:t xml:space="preserve">AI evaluations are probabilistic controls.</w:t>
       </w:r>
       <w:r>
-        <w:t xml:space="preserve"> </w:t>
-      </w:r>
-      <w:r>
-        <w:t xml:space="preserve">Pair LLM-as-judge scoring with human review, golden sets and deterministic policy checks for anything high-stakes — don’t treat an eval score as a compliance control on its own.</w:t>
+        <w:t xml:space="preserve"> Pair LLM-as-judge scoring with human review, golden sets and deterministic policy checks for anything high-stakes — don’t treat an eval score as a compliance control on its own.</w:t>
       </w:r>
     </w:p>
     <w:p>
@@ -3434,10 +2921,7 @@
         <w:t xml:space="preserve">Auto-instrumentation won’t cover everything.</w:t>
       </w:r>
       <w:r>
-        <w:t xml:space="preserve"> </w:t>
-      </w:r>
-      <w:r>
-        <w:t xml:space="preserve">Proprietary orchestration or unsupported frameworks need manual spans/OpenTelemetry instrumentation — budget for this explicitly rather than assuming SDK coverage is complete.</w:t>
+        <w:t xml:space="preserve"> Proprietary orchestration or unsupported frameworks need manual spans/OpenTelemetry instrumentation — budget for this explicitly rather than assuming SDK coverage is complete.</w:t>
       </w:r>
     </w:p>
     <w:p>
@@ -3995,10 +3479,7 @@
         <w:pStyle w:val="FirstParagraph"/>
       </w:pPr>
       <w:r>
-        <w:t xml:space="preserve">Source:</w:t>
-      </w:r>
-      <w:r>
-        <w:t xml:space="preserve"> </w:t>
+        <w:t xml:space="preserve">Source: </w:t>
       </w:r>
       <w:r>
         <w:rPr>
@@ -4229,10 +3710,7 @@
               <w:t xml:space="preserve">Done in mock form.</w:t>
             </w:r>
             <w:r>
-              <w:t xml:space="preserve"> </w:t>
-            </w:r>
-            <w:r>
-              <w:t xml:space="preserve">Telemetry contract defined and matched to the addendum; one workflow (Order Support &amp; Returns Assistant) fully instrumented — as synthetic data, not live traffic</w:t>
+              <w:t xml:space="preserve"> Telemetry contract defined and matched to the addendum; one workflow (Order Support &amp; Returns Assistant) fully instrumented — as synthetic data, not live traffic</w:t>
             </w:r>
           </w:p>
         </w:tc>
@@ -4298,10 +3776,7 @@
               <w:t xml:space="preserve">Done in mock form.</w:t>
             </w:r>
             <w:r>
-              <w:t xml:space="preserve"> </w:t>
-            </w:r>
-            <w:r>
-              <w:t xml:space="preserve">All 7 dashboards built; SLO/monitor definitions stubbed but not wired to a real alerting channel; three seeded storylines demonstrate the detection → triage narrative but aren’t live</w:t>
+              <w:t xml:space="preserve"> All 7 dashboards built; SLO/monitor definitions stubbed but not wired to a real alerting channel; three seeded storylines demonstrate the detection → triage narrative but aren’t live</w:t>
             </w:r>
           </w:p>
         </w:tc>
@@ -4367,10 +3842,7 @@
               <w:t xml:space="preserve">Partially done.</w:t>
             </w:r>
             <w:r>
-              <w:t xml:space="preserve"> </w:t>
-            </w:r>
-            <w:r>
-              <w:t xml:space="preserve">Guardrail/policy-decision telemetry, approval-bypass tracking and a mocked evaluation-harness series are all modelled. Still not modelled: a real eval harness, bias/fairness flags, refusal quality, human override rate</w:t>
+              <w:t xml:space="preserve"> Guardrail/policy-decision telemetry, approval-bypass tracking and a mocked evaluation-harness series are all modelled. Still not modelled: a real eval harness, bias/fairness flags, refusal quality, human override rate</w:t>
             </w:r>
           </w:p>
         </w:tc>
@@ -4436,10 +3908,7 @@
               <w:t xml:space="preserve">Not started.</w:t>
             </w:r>
             <w:r>
-              <w:t xml:space="preserve"> </w:t>
-            </w:r>
-            <w:r>
-              <w:t xml:space="preserve">This repo is a single-use-case reference; extracting it into a reusable instrumentation library is the next phase once a real workflow is live</w:t>
+              <w:t xml:space="preserve"> This repo is a single-use-case reference; extracting it into a reusable instrumentation library is the next phase once a real workflow is live</w:t>
             </w:r>
           </w:p>
         </w:tc>
@@ -4482,10 +3951,7 @@
         <w:pStyle w:val="Compact"/>
       </w:pPr>
       <w:r>
-        <w:t xml:space="preserve">Named owner assigned per accountability layer (Platform Engineering, Cyber Security, Data Governance, Responsible AI/Risk, Product Owner, Architecture) — see</w:t>
-      </w:r>
-      <w:r>
-        <w:t xml:space="preserve"> </w:t>
+        <w:t xml:space="preserve">Named owner assigned per accountability layer (Platform Engineering, Cyber Security, Data Governance, Responsible AI/Risk, Product Owner, Architecture) — see </w:t>
       </w:r>
       <w:hyperlink r:id="rId32">
         <w:r>
@@ -4508,55 +3974,7 @@
         <w:pStyle w:val="Compact"/>
       </w:pPr>
       <w:r>
-        <w:t xml:space="preserve">Risk tier definitions agreed for the first pilot workflow (what makes a workflow</w:t>
-      </w:r>
-      <w:r>
-        <w:t xml:space="preserve"> </w:t>
-      </w:r>
-      <w:r>
-        <w:t xml:space="preserve">“</w:t>
-      </w:r>
-      <w:r>
-        <w:t xml:space="preserve">low</w:t>
-      </w:r>
-      <w:r>
-        <w:t xml:space="preserve">”</w:t>
-      </w:r>
-      <w:r>
-        <w:t xml:space="preserve">,</w:t>
-      </w:r>
-      <w:r>
-        <w:t xml:space="preserve"> </w:t>
-      </w:r>
-      <w:r>
-        <w:t xml:space="preserve">“</w:t>
-      </w:r>
-      <w:r>
-        <w:t xml:space="preserve">medium</w:t>
-      </w:r>
-      <w:r>
-        <w:t xml:space="preserve">”</w:t>
-      </w:r>
-      <w:r>
-        <w:t xml:space="preserve">,</w:t>
-      </w:r>
-      <w:r>
-        <w:t xml:space="preserve"> </w:t>
-      </w:r>
-      <w:r>
-        <w:t xml:space="preserve">“</w:t>
-      </w:r>
-      <w:r>
-        <w:t xml:space="preserve">high</w:t>
-      </w:r>
-      <w:r>
-        <w:t xml:space="preserve">”</w:t>
-      </w:r>
-      <w:r>
-        <w:t xml:space="preserve"> </w:t>
-      </w:r>
-      <w:r>
-        <w:t xml:space="preserve">risk — this drives SLO targets and approval requirements).</w:t>
+        <w:t>Risk tier definitions agreed for the first pilot workflow (what makes a workflow “low”, “medium”, “high” risk — this drives SLO targets and approval requirements).</w:t>
       </w:r>
     </w:p>
     <w:p>
@@ -4568,10 +3986,7 @@
         <w:pStyle w:val="Compact"/>
       </w:pPr>
       <w:r>
-        <w:t xml:space="preserve">A redaction/classification/retention policy signed off</w:t>
-      </w:r>
-      <w:r>
-        <w:t xml:space="preserve"> </w:t>
+        <w:t xml:space="preserve">A redaction/classification/retention policy signed off </w:t>
       </w:r>
       <w:r>
         <w:rPr>
@@ -4580,10 +3995,7 @@
         <w:t xml:space="preserve">before</w:t>
       </w:r>
       <w:r>
-        <w:t xml:space="preserve"> </w:t>
-      </w:r>
-      <w:r>
-        <w:t xml:space="preserve">any real prompt or output content is logged — this is a data governance and legal decision, not an engineering default.</w:t>
+        <w:t xml:space="preserve"> any real prompt or output content is logged — this is a data governance and legal decision, not an engineering default.</w:t>
       </w:r>
     </w:p>
     <w:p>
@@ -4629,10 +4041,7 @@
         <w:pStyle w:val="Compact"/>
       </w:pPr>
       <w:r>
-        <w:t xml:space="preserve">Choice of instrumentation approach: Datadog’s LLM/Agent Observability SDK (where the framework is supported) vs. OpenTelemetry GenAI semantic conventions (for cross-vendor portability or unsupported frameworks) — see</w:t>
-      </w:r>
-      <w:r>
-        <w:t xml:space="preserve"> </w:t>
+        <w:t xml:space="preserve">Choice of instrumentation approach: Datadog’s LLM/Agent Observability SDK (where the framework is supported) vs. OpenTelemetry GenAI semantic conventions (for cross-vendor portability or unsupported frameworks) — see </w:t>
       </w:r>
       <w:hyperlink r:id="rId71">
         <w:r>
@@ -4667,10 +4076,7 @@
         <w:pStyle w:val="Compact"/>
       </w:pPr>
       <w:r>
-        <w:t xml:space="preserve">A tag taxonomy agreed and enforced</w:t>
-      </w:r>
-      <w:r>
-        <w:t xml:space="preserve"> </w:t>
+        <w:t xml:space="preserve">A tag taxonomy agreed and enforced </w:t>
       </w:r>
       <w:r>
         <w:rPr>
@@ -4679,10 +4085,7 @@
         <w:t xml:space="preserve">before</w:t>
       </w:r>
       <w:r>
-        <w:t xml:space="preserve"> </w:t>
-      </w:r>
-      <w:r>
-        <w:t xml:space="preserve">scaling past the pilot (per the addendum’s explicit caveat: high-cardinality raw IDs as primary dimensions get expensive and noisy fast).</w:t>
+        <w:t xml:space="preserve"> scaling past the pilot (per the addendum’s explicit caveat: high-cardinality raw IDs as primary dimensions get expensive and noisy fast).</w:t>
       </w:r>
     </w:p>
     <w:p>
@@ -4694,10 +4097,7 @@
         <w:pStyle w:val="Compact"/>
       </w:pPr>
       <w:r>
-        <w:t xml:space="preserve">An on-call / alert-routing target (PagerDuty, Slack, ServiceNow) to wire the monitor and SLO definitions in</w:t>
-      </w:r>
-      <w:r>
-        <w:t xml:space="preserve"> </w:t>
+        <w:t xml:space="preserve">An on-call / alert-routing target (PagerDuty, Slack, ServiceNow) to wire the monitor and SLO definitions in </w:t>
       </w:r>
       <w:r>
         <w:rPr>
@@ -4706,13 +4106,7 @@
         <w:t xml:space="preserve">datadog/monitors/</w:t>
       </w:r>
       <w:r>
-        <w:t xml:space="preserve"> </w:t>
-      </w:r>
-      <w:r>
-        <w:t xml:space="preserve">and</w:t>
-      </w:r>
-      <w:r>
-        <w:t xml:space="preserve"> </w:t>
+        <w:t xml:space="preserve"> and </w:t>
       </w:r>
       <w:r>
         <w:rPr>
@@ -4721,10 +4115,7 @@
         <w:t xml:space="preserve">datadog/slos/</w:t>
       </w:r>
       <w:r>
-        <w:t xml:space="preserve"> </w:t>
-      </w:r>
-      <w:r>
-        <w:t xml:space="preserve">to — they’re currently definitions only, not live.</w:t>
+        <w:t xml:space="preserve"> to — they’re currently definitions only, not live.</w:t>
       </w:r>
     </w:p>
     <w:p>
@@ -4788,37 +4179,7 @@
         <w:pStyle w:val="FirstParagraph"/>
       </w:pPr>
       <w:r>
-        <w:t xml:space="preserve">The roadmap is sequential for good reason: Weeks 3–6 dashboards are only trustworthy once Weeks 0–2’s telemetry contract and tag taxonomy are locked (retrofitting tags after scaling is expensive), and Weeks 7–10’s governance metrics are only meaningful once a real evaluation harness exists — building the Security/RAG dashboards on synthetic eval data indefinitely would quietly convert a demo into a false assurance. Treat the Weeks 7–10 phase as a hard gate before this pattern is presented as</w:t>
-      </w:r>
-      <w:r>
-        <w:t xml:space="preserve"> </w:t>
-      </w:r>
-      <w:r>
-        <w:t xml:space="preserve">“</w:t>
-      </w:r>
-      <w:r>
-        <w:t xml:space="preserve">production observability</w:t>
-      </w:r>
-      <w:r>
-        <w:t xml:space="preserve">”</w:t>
-      </w:r>
-      <w:r>
-        <w:t xml:space="preserve"> </w:t>
-      </w:r>
-      <w:r>
-        <w:t xml:space="preserve">to a risk committee, not just as</w:t>
-      </w:r>
-      <w:r>
-        <w:t xml:space="preserve"> </w:t>
-      </w:r>
-      <w:r>
-        <w:t xml:space="preserve">“</w:t>
-      </w:r>
-      <w:r>
-        <w:t xml:space="preserve">nice to have eventually.</w:t>
-      </w:r>
-      <w:r>
-        <w:t xml:space="preserve">”</w:t>
+        <w:t>The roadmap is sequential for good reason: Weeks 3–6 dashboards are only trustworthy once Weeks 0–2’s telemetry contract and tag taxonomy are locked (retrofitting tags after scaling is expensive), and Weeks 7–10’s governance metrics are only meaningful once a real evaluation harness exists — building the Security/RAG dashboards on synthetic eval data indefinitely would quietly convert a demo into a false assurance. Treat the Weeks 7–10 phase as a hard gate before this pattern is presented as “production observability” to a risk committee, not just as “nice to have eventually.”</w:t>
       </w:r>
     </w:p>
     <w:p>
@@ -4912,10 +4273,7 @@
         <w:pStyle w:val="FirstParagraph"/>
       </w:pPr>
       <w:r>
-        <w:t xml:space="preserve">This page is the technical bridge from</w:t>
-      </w:r>
-      <w:r>
-        <w:t xml:space="preserve"> </w:t>
+        <w:t xml:space="preserve">This page is the technical bridge from </w:t>
       </w:r>
       <w:r>
         <w:rPr>
@@ -4924,10 +4282,7 @@
         <w:t xml:space="preserve">genai-observability-demo/datadog/</w:t>
       </w:r>
       <w:r>
-        <w:t xml:space="preserve"> </w:t>
-      </w:r>
-      <w:r>
-        <w:t xml:space="preserve">(the migration kit already in this repo) to a real Datadog tenant. Nothing described here is live — these are illustrative dashboards-as-code templates and monitor/SLO definitions, using a proposed metric namespace (</w:t>
+        <w:t xml:space="preserve"> (the migration kit already in this repo) to a real Datadog tenant. Nothing described here is live — these are illustrative dashboards-as-code templates and monitor/SLO definitions, using a proposed metric namespace (</w:t>
       </w:r>
       <w:r>
         <w:rPr>
@@ -4936,10 +4291,7 @@
         <w:t xml:space="preserve">genai.*</w:t>
       </w:r>
       <w:r>
-        <w:t xml:space="preserve">) consistent with</w:t>
-      </w:r>
-      <w:r>
-        <w:t xml:space="preserve"> </w:t>
+        <w:t xml:space="preserve">) consistent with </w:t>
       </w:r>
       <w:hyperlink r:id="rId25">
         <w:r>
@@ -5099,10 +4451,7 @@
               <w:t xml:space="preserve">Datadog LLM Observability SDK</w:t>
             </w:r>
             <w:r>
-              <w:t xml:space="preserve"> </w:t>
-            </w:r>
-            <w:r>
-              <w:t xml:space="preserve">(</w:t>
+              <w:t xml:space="preserve"> (</w:t>
             </w:r>
             <w:hyperlink r:id="rId62">
               <w:r>
@@ -5192,10 +4541,7 @@
               <w:t xml:space="preserve">OpenTelemetry GenAI semantic conventions</w:t>
             </w:r>
             <w:r>
-              <w:t xml:space="preserve"> </w:t>
-            </w:r>
-            <w:r>
-              <w:t xml:space="preserve">(</w:t>
+              <w:t xml:space="preserve"> (</w:t>
             </w:r>
             <w:hyperlink r:id="rId59">
               <w:r>
@@ -5505,10 +4851,7 @@
               <w:t xml:space="preserve">use_case, tenant, cost_category</w:t>
             </w:r>
             <w:r>
-              <w:t xml:space="preserve"> </w:t>
-            </w:r>
-            <w:r>
-              <w:t xml:space="preserve">(</w:t>
+              <w:t xml:space="preserve"> (</w:t>
             </w:r>
             <w:r>
               <w:rPr>
@@ -5661,10 +5004,7 @@
               <w:t xml:space="preserve">provider, model, token_type</w:t>
             </w:r>
             <w:r>
-              <w:t xml:space="preserve"> </w:t>
-            </w:r>
-            <w:r>
-              <w:t xml:space="preserve">(</w:t>
+              <w:t xml:space="preserve"> (</w:t>
             </w:r>
             <w:r>
               <w:rPr>
@@ -6013,10 +5353,7 @@
               <w:t xml:space="preserve">use_case</w:t>
             </w:r>
             <w:r>
-              <w:t xml:space="preserve"> </w:t>
-            </w:r>
-            <w:r>
-              <w:t xml:space="preserve">— from evaluation harness, not raw traces</w:t>
+              <w:t xml:space="preserve"> — from evaluation harness, not raw traces</w:t>
             </w:r>
           </w:p>
         </w:tc>
@@ -6060,10 +5397,7 @@
               <w:t xml:space="preserve">use_case</w:t>
             </w:r>
             <w:r>
-              <w:t xml:space="preserve"> </w:t>
-            </w:r>
-            <w:r>
-              <w:t xml:space="preserve">— from evaluation harness</w:t>
+              <w:t xml:space="preserve"> — from evaluation harness</w:t>
             </w:r>
           </w:p>
         </w:tc>
@@ -6107,10 +5441,7 @@
               <w:t xml:space="preserve">use_case</w:t>
             </w:r>
             <w:r>
-              <w:t xml:space="preserve"> </w:t>
-            </w:r>
-            <w:r>
-              <w:t xml:space="preserve">— from evaluation harness</w:t>
+              <w:t xml:space="preserve"> — from evaluation harness</w:t>
             </w:r>
           </w:p>
         </w:tc>
@@ -6154,10 +5485,7 @@
               <w:t xml:space="preserve">use_case</w:t>
             </w:r>
             <w:r>
-              <w:t xml:space="preserve"> </w:t>
-            </w:r>
-            <w:r>
-              <w:t xml:space="preserve">— from evaluation harness</w:t>
+              <w:t xml:space="preserve"> — from evaluation harness</w:t>
             </w:r>
           </w:p>
         </w:tc>
@@ -6201,10 +5529,7 @@
               <w:t xml:space="preserve">artefact</w:t>
             </w:r>
             <w:r>
-              <w:t xml:space="preserve"> </w:t>
-            </w:r>
-            <w:r>
-              <w:t xml:space="preserve">(</w:t>
+              <w:t xml:space="preserve"> (</w:t>
             </w:r>
             <w:r>
               <w:rPr>
@@ -6266,10 +5591,7 @@
               <w:t xml:space="preserve">artefact</w:t>
             </w:r>
             <w:r>
-              <w:t xml:space="preserve"> </w:t>
-            </w:r>
-            <w:r>
-              <w:t xml:space="preserve">— from scheduled eval run</w:t>
+              <w:t xml:space="preserve"> — from scheduled eval run</w:t>
             </w:r>
           </w:p>
         </w:tc>
@@ -6313,10 +5635,7 @@
               <w:t xml:space="preserve">event_type</w:t>
             </w:r>
             <w:r>
-              <w:t xml:space="preserve"> </w:t>
-            </w:r>
-            <w:r>
-              <w:t xml:space="preserve">(</w:t>
+              <w:t xml:space="preserve"> (</w:t>
             </w:r>
             <w:r>
               <w:rPr>
@@ -6334,10 +5653,7 @@
               <w:t xml:space="preserve">rollback</w:t>
             </w:r>
             <w:r>
-              <w:t xml:space="preserve">),</w:t>
-            </w:r>
-            <w:r>
-              <w:t xml:space="preserve"> </w:t>
+              <w:t xml:space="preserve">), </w:t>
             </w:r>
             <w:r>
               <w:rPr>
@@ -6395,10 +5711,7 @@
         <w:pStyle w:val="BodyText"/>
       </w:pPr>
       <w:r>
-        <w:t xml:space="preserve">Treat this list as a starting convention, not a fixed spec — LLM Observability auto-generates many equivalent metrics natively; the</w:t>
-      </w:r>
-      <w:r>
-        <w:t xml:space="preserve"> </w:t>
+        <w:t xml:space="preserve">Treat this list as a starting convention, not a fixed spec — LLM Observability auto-generates many equivalent metrics natively; the </w:t>
       </w:r>
       <w:r>
         <w:rPr>
@@ -6407,10 +5720,7 @@
         <w:t xml:space="preserve">genai.*</w:t>
       </w:r>
       <w:r>
-        <w:t xml:space="preserve"> </w:t>
-      </w:r>
-      <w:r>
-        <w:t xml:space="preserve">names above are for custom metrics where auto-instrumentation doesn’t reach.</w:t>
+        <w:t xml:space="preserve"> names above are for custom metrics where auto-instrumentation doesn’t reach.</w:t>
       </w:r>
     </w:p>
     <w:p>
@@ -6434,13 +5744,7 @@
         <w:t xml:space="preserve">datadog/dashboards/</w:t>
       </w:r>
       <w:r>
-        <w:t xml:space="preserve"> </w:t>
-      </w:r>
-      <w:r>
-        <w:t xml:space="preserve">contains one JSON template per dashboard in the 7-dashboard pack, each flagged</w:t>
-      </w:r>
-      <w:r>
-        <w:t xml:space="preserve"> </w:t>
+        <w:t xml:space="preserve"> contains one JSON template per dashboard in the 7-dashboard pack, each flagged </w:t>
       </w:r>
       <w:r>
         <w:rPr>
@@ -6449,10 +5753,7 @@
         <w:t xml:space="preserve">"status": "implemented_in_demo"</w:t>
       </w:r>
       <w:r>
-        <w:t xml:space="preserve"> </w:t>
-      </w:r>
-      <w:r>
-        <w:t xml:space="preserve">and matching the 7 tabs in the static app:</w:t>
+        <w:t xml:space="preserve"> and matching the 7 tabs in the static app:</w:t>
       </w:r>
     </w:p>
     <w:tbl>
@@ -6634,10 +5935,7 @@
               <w:jc w:val="left"/>
             </w:pPr>
             <w:r>
-              <w:t xml:space="preserve">Agent Behaviour and Agency — carries a</w:t>
-            </w:r>
-            <w:r>
-              <w:t xml:space="preserve"> </w:t>
+              <w:t xml:space="preserve">Agent Behaviour and Agency — carries a </w:t>
             </w:r>
             <w:r>
               <w:rPr>
@@ -6646,10 +5944,7 @@
               <w:t xml:space="preserve">"caveat"</w:t>
             </w:r>
             <w:r>
-              <w:t xml:space="preserve"> </w:t>
-            </w:r>
-            <w:r>
-              <w:t xml:space="preserve">field: single-agent scenario, multi-agent handoff metrics out of scope</w:t>
+              <w:t xml:space="preserve"> field: single-agent scenario, multi-agent handoff metrics out of scope</w:t>
             </w:r>
           </w:p>
         </w:tc>
@@ -6720,28 +6015,7 @@
         <w:t xml:space="preserve">Import path:</w:t>
       </w:r>
       <w:r>
-        <w:t xml:space="preserve"> </w:t>
-      </w:r>
-      <w:r>
-        <w:t xml:space="preserve">Datadog UI →</w:t>
-      </w:r>
-      <w:r>
-        <w:t xml:space="preserve"> </w:t>
-      </w:r>
-      <w:r>
-        <w:t xml:space="preserve">“</w:t>
-      </w:r>
-      <w:r>
-        <w:t xml:space="preserve">Import dashboard JSON</w:t>
-      </w:r>
-      <w:r>
-        <w:t xml:space="preserve">”</w:t>
-      </w:r>
-      <w:r>
-        <w:t xml:space="preserve">, or programmatically via Terraform’s</w:t>
-      </w:r>
-      <w:r>
-        <w:t xml:space="preserve"> </w:t>
+        <w:t xml:space="preserve"> Datadog UI → “Import dashboard JSON”, or programmatically via Terraform’s </w:t>
       </w:r>
       <w:r>
         <w:rPr>
@@ -6750,13 +6024,7 @@
         <w:t xml:space="preserve">datadog_dashboard</w:t>
       </w:r>
       <w:r>
-        <w:t xml:space="preserve"> </w:t>
-      </w:r>
-      <w:r>
-        <w:t xml:space="preserve">resource, or the</w:t>
-      </w:r>
-      <w:r>
-        <w:t xml:space="preserve"> </w:t>
+        <w:t xml:space="preserve"> resource, or the </w:t>
       </w:r>
       <w:hyperlink r:id="rId80">
         <w:r>
@@ -6791,10 +6059,7 @@
         <w:t xml:space="preserve">datadog/monitors/</w:t>
       </w:r>
       <w:r>
-        <w:t xml:space="preserve"> </w:t>
-      </w:r>
-      <w:r>
-        <w:t xml:space="preserve">holds five illustrative alert definitions, each tagged with its source clause in the addendum §8:</w:t>
+        <w:t xml:space="preserve"> holds five illustrative alert definitions, each tagged with its source clause in the addendum §8:</w:t>
       </w:r>
     </w:p>
     <w:tbl>
@@ -6982,13 +6247,7 @@
               <w:t xml:space="preserve">@pagerduty-genai-oncall</w:t>
             </w:r>
             <w:r>
-              <w:t xml:space="preserve"> </w:t>
-            </w:r>
-            <w:r>
-              <w:t xml:space="preserve">— reliability</w:t>
-            </w:r>
-            <w:r>
-              <w:t xml:space="preserve"> </w:t>
+              <w:t xml:space="preserve"> — reliability </w:t>
             </w:r>
             <w:r>
               <w:rPr>
@@ -6997,10 +6256,7 @@
               <w:t xml:space="preserve">and</w:t>
             </w:r>
             <w:r>
-              <w:t xml:space="preserve"> </w:t>
-            </w:r>
-            <w:r>
-              <w:t xml:space="preserve">cost-risk event</w:t>
+              <w:t xml:space="preserve"> cost-risk event</w:t>
             </w:r>
           </w:p>
         </w:tc>
@@ -7044,10 +6300,7 @@
               <w:t xml:space="preserve">@security-oncall @pagerduty-genai-oncall</w:t>
             </w:r>
             <w:r>
-              <w:t xml:space="preserve">, tagged</w:t>
-            </w:r>
-            <w:r>
-              <w:t xml:space="preserve"> </w:t>
+              <w:t xml:space="preserve">, tagged </w:t>
             </w:r>
             <w:r>
               <w:rPr>
@@ -7108,13 +6361,7 @@
         <w:t xml:space="preserve">Import path:</w:t>
       </w:r>
       <w:r>
-        <w:t xml:space="preserve"> </w:t>
-      </w:r>
-      <w:r>
-        <w:t xml:space="preserve">Monitors API or</w:t>
-      </w:r>
-      <w:r>
-        <w:t xml:space="preserve"> </w:t>
+        <w:t xml:space="preserve"> Monitors API or </w:t>
       </w:r>
       <w:r>
         <w:rPr>
@@ -7123,13 +6370,7 @@
         <w:t xml:space="preserve">datadog_monitor</w:t>
       </w:r>
       <w:r>
-        <w:t xml:space="preserve"> </w:t>
-      </w:r>
-      <w:r>
-        <w:t xml:space="preserve">Terraform resource. Each JSON’s</w:t>
-      </w:r>
-      <w:r>
-        <w:t xml:space="preserve"> </w:t>
+        <w:t xml:space="preserve"> Terraform resource. Each JSON’s </w:t>
       </w:r>
       <w:r>
         <w:rPr>
@@ -7138,10 +6379,7 @@
         <w:t xml:space="preserve">notify</w:t>
       </w:r>
       <w:r>
-        <w:t xml:space="preserve"> </w:t>
-      </w:r>
-      <w:r>
-        <w:t xml:space="preserve">targets are placeholders (</w:t>
+        <w:t xml:space="preserve"> targets are placeholders (</w:t>
       </w:r>
       <w:r>
         <w:rPr>
@@ -7150,10 +6388,7 @@
         <w:t xml:space="preserve">@pagerduty-genai-oncall</w:t>
       </w:r>
       <w:r>
-        <w:t xml:space="preserve">,</w:t>
-      </w:r>
-      <w:r>
-        <w:t xml:space="preserve"> </w:t>
+        <w:t xml:space="preserve">, </w:t>
       </w:r>
       <w:r>
         <w:rPr>
@@ -7186,10 +6421,7 @@
         <w:t xml:space="preserve">datadog/slos/</w:t>
       </w:r>
       <w:r>
-        <w:t xml:space="preserve"> </w:t>
-      </w:r>
-      <w:r>
-        <w:t xml:space="preserve">defines SLO objects that reference the monitors above as time-slices:</w:t>
+        <w:t xml:space="preserve"> defines SLO objects that reference the monitors above as time-slices:</w:t>
       </w:r>
     </w:p>
     <w:tbl>
@@ -7342,25 +6574,7 @@
       </w:pPr>
       <w:bookmarkStart w:id="83" w:name="what-connectors-means-in-this-context"/>
       <w:r>
-        <w:t xml:space="preserve">What</w:t>
-      </w:r>
-      <w:r>
-        <w:t xml:space="preserve"> </w:t>
-      </w:r>
-      <w:r>
-        <w:t xml:space="preserve">“</w:t>
-      </w:r>
-      <w:r>
-        <w:t xml:space="preserve">connectors</w:t>
-      </w:r>
-      <w:r>
-        <w:t xml:space="preserve">”</w:t>
-      </w:r>
-      <w:r>
-        <w:t xml:space="preserve"> </w:t>
-      </w:r>
-      <w:r>
-        <w:t xml:space="preserve">means in this context</w:t>
+        <w:t>What “connectors” means in this context</w:t>
       </w:r>
       <w:bookmarkEnd w:id="83"/>
     </w:p>
@@ -7369,25 +6583,7 @@
         <w:pStyle w:val="FirstParagraph"/>
       </w:pPr>
       <w:r>
-        <w:t xml:space="preserve">There is no single</w:t>
-      </w:r>
-      <w:r>
-        <w:t xml:space="preserve"> </w:t>
-      </w:r>
-      <w:r>
-        <w:t xml:space="preserve">“</w:t>
-      </w:r>
-      <w:r>
-        <w:t xml:space="preserve">Datadog connector</w:t>
-      </w:r>
-      <w:r>
-        <w:t xml:space="preserve">”</w:t>
-      </w:r>
-      <w:r>
-        <w:t xml:space="preserve"> </w:t>
-      </w:r>
-      <w:r>
-        <w:t xml:space="preserve">— the connection points are:</w:t>
+        <w:t>There is no single “Datadog connector” — the connection points are:</w:t>
       </w:r>
     </w:p>
     <w:p>
@@ -7414,10 +6610,7 @@
         <w:t xml:space="preserve">otlp</w:t>
       </w:r>
       <w:r>
-        <w:t xml:space="preserve"> </w:t>
-      </w:r>
-      <w:r>
-        <w:t xml:space="preserve">receiver → Datadog exporter), or direct API/intake endpoints for traces, spans, logs and metrics.</w:t>
+        <w:t xml:space="preserve"> receiver → Datadog exporter), or direct API/intake endpoints for traces, spans, logs and metrics.</w:t>
       </w:r>
     </w:p>
     <w:p>
@@ -7435,10 +6628,7 @@
         <w:t xml:space="preserve">Alerting egress</w:t>
       </w:r>
       <w:r>
-        <w:t xml:space="preserve">: Datadog’s native integrations to PagerDuty, Slack, ServiceNow, Microsoft Teams, email and webhooks — configured once, referenced by name in every monitor’s</w:t>
-      </w:r>
-      <w:r>
-        <w:t xml:space="preserve"> </w:t>
+        <w:t xml:space="preserve">: Datadog’s native integrations to PagerDuty, Slack, ServiceNow, Microsoft Teams, email and webhooks — configured once, referenced by name in every monitor’s </w:t>
       </w:r>
       <w:r>
         <w:rPr>
@@ -7447,10 +6637,7 @@
         <w:t xml:space="preserve">notify</w:t>
       </w:r>
       <w:r>
-        <w:t xml:space="preserve"> </w:t>
-      </w:r>
-      <w:r>
-        <w:t xml:space="preserve">field.</w:t>
+        <w:t xml:space="preserve"> field.</w:t>
       </w:r>
     </w:p>
     <w:p>
@@ -7486,10 +6673,7 @@
         <w:t xml:space="preserve">Evaluations</w:t>
       </w:r>
       <w:r>
-        <w:t xml:space="preserve">: Datadog Managed Evaluations (for supported patterns) or Custom Evaluations (bring-your-own LLM-as-judge/scoring pipeline) — this is the piece this demo cannot mock convincingly, per</w:t>
-      </w:r>
-      <w:r>
-        <w:t xml:space="preserve"> </w:t>
+        <w:t xml:space="preserve">: Datadog Managed Evaluations (for supported patterns) or Custom Evaluations (bring-your-own LLM-as-judge/scoring pipeline) — this is the piece this demo cannot mock convincingly, per </w:t>
       </w:r>
       <w:hyperlink r:id="rId32">
         <w:r>
@@ -7585,10 +6769,7 @@
         <w:pStyle w:val="Compact"/>
       </w:pPr>
       <w:r>
-        <w:t xml:space="preserve">Replace</w:t>
-      </w:r>
-      <w:r>
-        <w:t xml:space="preserve"> </w:t>
+        <w:t xml:space="preserve">Replace </w:t>
       </w:r>
       <w:r>
         <w:rPr>
@@ -7597,10 +6778,7 @@
         <w:t xml:space="preserve">data/generator/*.py</w:t>
       </w:r>
       <w:r>
-        <w:t xml:space="preserve"> </w:t>
-      </w:r>
-      <w:r>
-        <w:t xml:space="preserve">with actual SDK/OTel instrumentation emitting the same field names into Datadog.</w:t>
+        <w:t xml:space="preserve"> with actual SDK/OTel instrumentation emitting the same field names into Datadog.</w:t>
       </w:r>
     </w:p>
     <w:p>
@@ -7612,10 +6790,7 @@
         <w:pStyle w:val="Compact"/>
       </w:pPr>
       <w:r>
-        <w:t xml:space="preserve">Replace</w:t>
-      </w:r>
-      <w:r>
-        <w:t xml:space="preserve"> </w:t>
+        <w:t xml:space="preserve">Replace </w:t>
       </w:r>
       <w:r>
         <w:rPr>
@@ -7624,13 +6799,7 @@
         <w:t xml:space="preserve">data/generator/aggregate_dashboard_summary.py</w:t>
       </w:r>
       <w:r>
-        <w:t xml:space="preserve"> </w:t>
-      </w:r>
-      <w:r>
-        <w:t xml:space="preserve">with real Datadog dashboard queries — the aggregation logic (daily P95, cost/successful-workflow, etc.) becomes the widget query definitions already drafted in</w:t>
-      </w:r>
-      <w:r>
-        <w:t xml:space="preserve"> </w:t>
+        <w:t xml:space="preserve"> with real Datadog dashboard queries — the aggregation logic (daily P95, cost/successful-workflow, etc.) becomes the widget query definitions already drafted in </w:t>
       </w:r>
       <w:r>
         <w:rPr>
@@ -7651,10 +6820,7 @@
         <w:pStyle w:val="Compact"/>
       </w:pPr>
       <w:r>
-        <w:t xml:space="preserve">Replace the static</w:t>
-      </w:r>
-      <w:r>
-        <w:t xml:space="preserve"> </w:t>
+        <w:t xml:space="preserve">Replace the static </w:t>
       </w:r>
       <w:r>
         <w:rPr>
@@ -7663,13 +6829,7 @@
         <w:t xml:space="preserve">dashboard/</w:t>
       </w:r>
       <w:r>
-        <w:t xml:space="preserve"> </w:t>
-      </w:r>
-      <w:r>
-        <w:t xml:space="preserve">app with native Datadog dashboards built from</w:t>
-      </w:r>
-      <w:r>
-        <w:t xml:space="preserve"> </w:t>
+        <w:t xml:space="preserve"> app with native Datadog dashboards built from </w:t>
       </w:r>
       <w:r>
         <w:rPr>
@@ -7678,10 +6838,7 @@
         <w:t xml:space="preserve">datadog/dashboards/*.json</w:t>
       </w:r>
       <w:r>
-        <w:t xml:space="preserve"> </w:t>
-      </w:r>
-      <w:r>
-        <w:t xml:space="preserve">— or keep the static app as an executive-facing summary view fed by the Datadog API instead of the local JSON file.</w:t>
+        <w:t xml:space="preserve"> — or keep the static app as an executive-facing summary view fed by the Datadog API instead of the local JSON file.</w:t>
       </w:r>
     </w:p>
     <w:p>
@@ -7693,10 +6850,7 @@
         <w:pStyle w:val="Compact"/>
       </w:pPr>
       <w:r>
-        <w:t xml:space="preserve">Wire</w:t>
-      </w:r>
-      <w:r>
-        <w:t xml:space="preserve"> </w:t>
+        <w:t xml:space="preserve">Wire </w:t>
       </w:r>
       <w:r>
         <w:rPr>
@@ -7705,13 +6859,7 @@
         <w:t xml:space="preserve">datadog/monitors/*.json</w:t>
       </w:r>
       <w:r>
-        <w:t xml:space="preserve"> </w:t>
-      </w:r>
-      <w:r>
-        <w:t xml:space="preserve">and</w:t>
-      </w:r>
-      <w:r>
-        <w:t xml:space="preserve"> </w:t>
+        <w:t xml:space="preserve"> and </w:t>
       </w:r>
       <w:r>
         <w:rPr>
@@ -7720,10 +6868,7 @@
         <w:t xml:space="preserve">datadog/slos/*.json</w:t>
       </w:r>
       <w:r>
-        <w:t xml:space="preserve"> </w:t>
-      </w:r>
-      <w:r>
-        <w:t xml:space="preserve">to real alert channels.</w:t>
+        <w:t xml:space="preserve"> to real alert channels.</w:t>
       </w:r>
     </w:p>
     <w:p>
@@ -7753,10 +6898,7 @@
         <w:pStyle w:val="FirstParagraph"/>
       </w:pPr>
       <w:r>
-        <w:t xml:space="preserve">This page is a</w:t>
-      </w:r>
-      <w:r>
-        <w:t xml:space="preserve"> </w:t>
+        <w:t xml:space="preserve">This page is a </w:t>
       </w:r>
       <w:r>
         <w:rPr>
@@ -7765,10 +6907,7 @@
         <w:t xml:space="preserve">build plan and prompt spec</w:t>
       </w:r>
       <w:r>
-        <w:t xml:space="preserve">, written so it can be handed directly to Claude Code (or a comparable engineering agent) to execute the mock-to-real migration described in</w:t>
-      </w:r>
-      <w:r>
-        <w:t xml:space="preserve"> </w:t>
+        <w:t xml:space="preserve">, written so it can be handed directly to Claude Code (or a comparable engineering agent) to execute the mock-to-real migration described in </w:t>
       </w:r>
       <w:hyperlink r:id="rId86">
         <w:r>
@@ -7779,13 +6918,7 @@
         </w:r>
       </w:hyperlink>
       <w:r>
-        <w:t xml:space="preserve"> </w:t>
-      </w:r>
-      <w:r>
-        <w:t xml:space="preserve">and</w:t>
-      </w:r>
-      <w:r>
-        <w:t xml:space="preserve"> </w:t>
+        <w:t xml:space="preserve"> and </w:t>
       </w:r>
       <w:hyperlink r:id="rId71">
         <w:r>
@@ -7824,13 +6957,7 @@
         <w:t xml:space="preserve">The synthetic schema is the target contract.</w:t>
       </w:r>
       <w:r>
-        <w:t xml:space="preserve"> </w:t>
-      </w:r>
-      <w:r>
-        <w:t xml:space="preserve">Do not redesign the telemetry schema; re-point it. Every field name in</w:t>
-      </w:r>
-      <w:r>
-        <w:t xml:space="preserve"> </w:t>
+        <w:t xml:space="preserve"> Do not redesign the telemetry schema; re-point it. Every field name in </w:t>
       </w:r>
       <w:r>
         <w:rPr>
@@ -7839,13 +6966,7 @@
         <w:t xml:space="preserve">data/synthetic/raw/*.csv</w:t>
       </w:r>
       <w:r>
-        <w:t xml:space="preserve"> </w:t>
-      </w:r>
-      <w:r>
-        <w:t xml:space="preserve">and</w:t>
-      </w:r>
-      <w:r>
-        <w:t xml:space="preserve"> </w:t>
+        <w:t xml:space="preserve"> and </w:t>
       </w:r>
       <w:r>
         <w:rPr>
@@ -7854,10 +6975,7 @@
         <w:t xml:space="preserve">docs/datadog-mapping.md</w:t>
       </w:r>
       <w:r>
-        <w:t xml:space="preserve"> </w:t>
-      </w:r>
-      <w:r>
-        <w:t xml:space="preserve">should appear, unchanged, in the real instrumentation.</w:t>
+        <w:t xml:space="preserve"> should appear, unchanged, in the real instrumentation.</w:t>
       </w:r>
     </w:p>
     <w:p>
@@ -7875,10 +6993,7 @@
         <w:t xml:space="preserve">No live credentials in the agent’s default context.</w:t>
       </w:r>
       <w:r>
-        <w:t xml:space="preserve"> </w:t>
-      </w:r>
-      <w:r>
-        <w:t xml:space="preserve">API keys, Datadog org access, PagerDuty/Slack tokens and any provider (OpenAI/Anthropic/Bedrock) credentials should be supplied only for the specific phase that needs them, via the human operator’s own secrets management — never committed, never requested in chat.</w:t>
+        <w:t xml:space="preserve"> API keys, Datadog org access, PagerDuty/Slack tokens and any provider (OpenAI/Anthropic/Bedrock) credentials should be supplied only for the specific phase that needs them, via the human operator’s own secrets management — never committed, never requested in chat.</w:t>
       </w:r>
     </w:p>
     <w:p>
@@ -7914,10 +7029,7 @@
         <w:t xml:space="preserve">Additive, reversible changes.</w:t>
       </w:r>
       <w:r>
-        <w:t xml:space="preserve"> </w:t>
-      </w:r>
-      <w:r>
-        <w:t xml:space="preserve">Each phase should be a mergeable, revertable unit of work — no phase should require a later phase to be safe to ship.</w:t>
+        <w:t xml:space="preserve"> Each phase should be a mergeable, revertable unit of work — no phase should require a later phase to be safe to ship.</w:t>
       </w:r>
     </w:p>
     <w:p>
@@ -7947,10 +7059,7 @@
         <w:pStyle w:val="Compact"/>
       </w:pPr>
       <w:r>
-        <w:t xml:space="preserve">Named owner assigned per accountability layer (see</w:t>
-      </w:r>
-      <w:r>
-        <w:t xml:space="preserve"> </w:t>
+        <w:t xml:space="preserve">Named owner assigned per accountability layer (see </w:t>
       </w:r>
       <w:hyperlink r:id="rId32">
         <w:r>
@@ -8021,13 +7130,7 @@
         <w:t xml:space="preserve">Goal:</w:t>
       </w:r>
       <w:r>
-        <w:t xml:space="preserve"> </w:t>
-      </w:r>
-      <w:r>
-        <w:t xml:space="preserve">replace</w:t>
-      </w:r>
-      <w:r>
-        <w:t xml:space="preserve"> </w:t>
+        <w:t xml:space="preserve"> replace </w:t>
       </w:r>
       <w:r>
         <w:rPr>
@@ -8036,10 +7139,7 @@
         <w:t xml:space="preserve">data/generator/generate_synthetic_data.py</w:t>
       </w:r>
       <w:r>
-        <w:t xml:space="preserve"> </w:t>
-      </w:r>
-      <w:r>
-        <w:t xml:space="preserve">with real instrumentation code, without touching production traffic yet.</w:t>
+        <w:t xml:space="preserve"> with real instrumentation code, without touching production traffic yet.</w:t>
       </w:r>
     </w:p>
     <w:p>
@@ -8047,16 +7147,7 @@
         <w:pStyle w:val="BodyText"/>
       </w:pPr>
       <w:r>
-        <w:t xml:space="preserve">Prompt-ready task for the agent:</w:t>
-      </w:r>
-      <w:r>
-        <w:t xml:space="preserve"> </w:t>
-      </w:r>
-      <w:r>
-        <w:t xml:space="preserve">&gt; Using</w:t>
-      </w:r>
-      <w:r>
-        <w:t xml:space="preserve"> </w:t>
+        <w:t xml:space="preserve">Prompt-ready task for the agent: &gt; Using </w:t>
       </w:r>
       <w:r>
         <w:rPr>
@@ -8065,13 +7156,7 @@
         <w:t xml:space="preserve">docs/datadog-mapping.md</w:t>
       </w:r>
       <w:r>
-        <w:t xml:space="preserve"> </w:t>
-      </w:r>
-      <w:r>
-        <w:t xml:space="preserve">as the field-level contract, scaffold Datadog LLM/Agent Observability SDK (or OpenTelemetry GenAI semantic-convention) instrumentation for the Order Support &amp; Returns Assistant workflow. Emit spans for</w:t>
-      </w:r>
-      <w:r>
-        <w:t xml:space="preserve"> </w:t>
+        <w:t xml:space="preserve"> as the field-level contract, scaffold Datadog LLM/Agent Observability SDK (or OpenTelemetry GenAI semantic-convention) instrumentation for the Order Support &amp; Returns Assistant workflow. Emit spans for </w:t>
       </w:r>
       <w:r>
         <w:rPr>
@@ -8080,10 +7165,7 @@
         <w:t xml:space="preserve">workflow</w:t>
       </w:r>
       <w:r>
-        <w:t xml:space="preserve">,</w:t>
-      </w:r>
-      <w:r>
-        <w:t xml:space="preserve"> </w:t>
+        <w:t xml:space="preserve">, </w:t>
       </w:r>
       <w:r>
         <w:rPr>
@@ -8092,10 +7174,7 @@
         <w:t xml:space="preserve">llm</w:t>
       </w:r>
       <w:r>
-        <w:t xml:space="preserve">,</w:t>
-      </w:r>
-      <w:r>
-        <w:t xml:space="preserve"> </w:t>
+        <w:t xml:space="preserve">, </w:t>
       </w:r>
       <w:r>
         <w:rPr>
@@ -8104,10 +7183,7 @@
         <w:t xml:space="preserve">retrieval</w:t>
       </w:r>
       <w:r>
-        <w:t xml:space="preserve">,</w:t>
-      </w:r>
-      <w:r>
-        <w:t xml:space="preserve"> </w:t>
+        <w:t xml:space="preserve">, </w:t>
       </w:r>
       <w:r>
         <w:rPr>
@@ -8116,13 +7192,7 @@
         <w:t xml:space="preserve">tool</w:t>
       </w:r>
       <w:r>
-        <w:t xml:space="preserve"> </w:t>
-      </w:r>
-      <w:r>
-        <w:t xml:space="preserve">and</w:t>
-      </w:r>
-      <w:r>
-        <w:t xml:space="preserve"> </w:t>
+        <w:t xml:space="preserve"> and </w:t>
       </w:r>
       <w:r>
         <w:rPr>
@@ -8131,13 +7201,7 @@
         <w:t xml:space="preserve">guardrail</w:t>
       </w:r>
       <w:r>
-        <w:t xml:space="preserve"> </w:t>
-      </w:r>
-      <w:r>
-        <w:t xml:space="preserve">matching the exact field names in</w:t>
-      </w:r>
-      <w:r>
-        <w:t xml:space="preserve"> </w:t>
+        <w:t xml:space="preserve"> matching the exact field names in </w:t>
       </w:r>
       <w:r>
         <w:rPr>
@@ -8160,10 +7224,7 @@
         <w:t xml:space="preserve">Human gate:</w:t>
       </w:r>
       <w:r>
-        <w:t xml:space="preserve"> </w:t>
-      </w:r>
-      <w:r>
-        <w:t xml:space="preserve">review that span field names match the contract 1:1 before any real ingestion is enabled; confirm no prompt/output content is logged unredacted.</w:t>
+        <w:t xml:space="preserve"> review that span field names match the contract 1:1 before any real ingestion is enabled; confirm no prompt/output content is logged unredacted.</w:t>
       </w:r>
     </w:p>
     <w:p>
@@ -8187,10 +7248,7 @@
         <w:t xml:space="preserve">Goal:</w:t>
       </w:r>
       <w:r>
-        <w:t xml:space="preserve"> </w:t>
-      </w:r>
-      <w:r>
-        <w:t xml:space="preserve">point the Phase 1 instrumentation at a real (non-production) Datadog environment.</w:t>
+        <w:t xml:space="preserve"> point the Phase 1 instrumentation at a real (non-production) Datadog environment.</w:t>
       </w:r>
     </w:p>
     <w:p>
@@ -8198,16 +7256,7 @@
         <w:pStyle w:val="BodyText"/>
       </w:pPr>
       <w:r>
-        <w:t xml:space="preserve">Prompt-ready task:</w:t>
-      </w:r>
-      <w:r>
-        <w:t xml:space="preserve"> </w:t>
-      </w:r>
-      <w:r>
-        <w:t xml:space="preserve">&gt; Wire the Phase 1 instrumentation to the Datadog Agent or OTel Collector, using the staging Datadog org credentials provided via [operator’s secrets mechanism]. Validate that</w:t>
-      </w:r>
-      <w:r>
-        <w:t xml:space="preserve"> </w:t>
+        <w:t xml:space="preserve">Prompt-ready task: &gt; Wire the Phase 1 instrumentation to the Datadog Agent or OTel Collector, using the staging Datadog org credentials provided via [operator’s secrets mechanism]. Validate that </w:t>
       </w:r>
       <w:r>
         <w:rPr>
@@ -8216,10 +7265,7 @@
         <w:t xml:space="preserve">genai.workflow.count</w:t>
       </w:r>
       <w:r>
-        <w:t xml:space="preserve">,</w:t>
-      </w:r>
-      <w:r>
-        <w:t xml:space="preserve"> </w:t>
+        <w:t xml:space="preserve">, </w:t>
       </w:r>
       <w:r>
         <w:rPr>
@@ -8228,10 +7274,7 @@
         <w:t xml:space="preserve">genai.llm.call.count</w:t>
       </w:r>
       <w:r>
-        <w:t xml:space="preserve">,</w:t>
-      </w:r>
-      <w:r>
-        <w:t xml:space="preserve"> </w:t>
+        <w:t xml:space="preserve">, </w:t>
       </w:r>
       <w:r>
         <w:rPr>
@@ -8240,13 +7283,7 @@
         <w:t xml:space="preserve">genai.tool.call.count</w:t>
       </w:r>
       <w:r>
-        <w:t xml:space="preserve"> </w:t>
-      </w:r>
-      <w:r>
-        <w:t xml:space="preserve">and</w:t>
-      </w:r>
-      <w:r>
-        <w:t xml:space="preserve"> </w:t>
+        <w:t xml:space="preserve"> and </w:t>
       </w:r>
       <w:r>
         <w:rPr>
@@ -8255,13 +7292,7 @@
         <w:t xml:space="preserve">genai.guardrail.decision.count</w:t>
       </w:r>
       <w:r>
-        <w:t xml:space="preserve"> </w:t>
-      </w:r>
-      <w:r>
-        <w:t xml:space="preserve">(see the metric namespace table in</w:t>
-      </w:r>
-      <w:r>
-        <w:t xml:space="preserve"> </w:t>
+        <w:t xml:space="preserve"> (see the metric namespace table in </w:t>
       </w:r>
       <w:r>
         <w:rPr>
@@ -8284,10 +7315,7 @@
         <w:t xml:space="preserve">Human gate:</w:t>
       </w:r>
       <w:r>
-        <w:t xml:space="preserve"> </w:t>
-      </w:r>
-      <w:r>
-        <w:t xml:space="preserve">confirm staging data looks correct before promoting the same config to production; confirm redaction is actually being applied to any logged content, not just planned.</w:t>
+        <w:t xml:space="preserve"> confirm staging data looks correct before promoting the same config to production; confirm redaction is actually being applied to any logged content, not just planned.</w:t>
       </w:r>
     </w:p>
     <w:p>
@@ -8311,10 +7339,7 @@
         <w:t xml:space="preserve">Goal:</w:t>
       </w:r>
       <w:r>
-        <w:t xml:space="preserve"> </w:t>
-      </w:r>
-      <w:r>
-        <w:t xml:space="preserve">replace the local-JSON static dashboard with native Datadog dashboards, and make the monitor/SLO definitions live.</w:t>
+        <w:t xml:space="preserve"> replace the local-JSON static dashboard with native Datadog dashboards, and make the monitor/SLO definitions live.</w:t>
       </w:r>
     </w:p>
     <w:p>
@@ -8322,16 +7347,7 @@
         <w:pStyle w:val="BodyText"/>
       </w:pPr>
       <w:r>
-        <w:t xml:space="preserve">Prompt-ready task:</w:t>
-      </w:r>
-      <w:r>
-        <w:t xml:space="preserve"> </w:t>
-      </w:r>
-      <w:r>
-        <w:t xml:space="preserve">&gt; Import all 7 templates in</w:t>
-      </w:r>
-      <w:r>
-        <w:t xml:space="preserve"> </w:t>
+        <w:t xml:space="preserve">Prompt-ready task: &gt; Import all 7 templates in </w:t>
       </w:r>
       <w:r>
         <w:rPr>
@@ -8340,13 +7356,7 @@
         <w:t xml:space="preserve">datadog/dashboards/*.json</w:t>
       </w:r>
       <w:r>
-        <w:t xml:space="preserve"> </w:t>
-      </w:r>
-      <w:r>
-        <w:t xml:space="preserve">into the staging Datadog org via the Dashboards API or</w:t>
-      </w:r>
-      <w:r>
-        <w:t xml:space="preserve"> </w:t>
+        <w:t xml:space="preserve"> into the staging Datadog org via the Dashboards API or </w:t>
       </w:r>
       <w:r>
         <w:rPr>
@@ -8355,13 +7365,7 @@
         <w:t xml:space="preserve">datadog_dashboard</w:t>
       </w:r>
       <w:r>
-        <w:t xml:space="preserve"> </w:t>
-      </w:r>
-      <w:r>
-        <w:t xml:space="preserve">Terraform resource, adapting metric names in each JSON to whatever Phase 1/2 instrumentation actually emits (auto-generated LLM Observability metrics vs. the</w:t>
-      </w:r>
-      <w:r>
-        <w:t xml:space="preserve"> </w:t>
+        <w:t xml:space="preserve"> Terraform resource, adapting metric names in each JSON to whatever Phase 1/2 instrumentation actually emits (auto-generated LLM Observability metrics vs. the </w:t>
       </w:r>
       <w:r>
         <w:rPr>
@@ -8370,13 +7374,7 @@
         <w:t xml:space="preserve">genai.*</w:t>
       </w:r>
       <w:r>
-        <w:t xml:space="preserve"> </w:t>
-      </w:r>
-      <w:r>
-        <w:t xml:space="preserve">custom convention). Import</w:t>
-      </w:r>
-      <w:r>
-        <w:t xml:space="preserve"> </w:t>
+        <w:t xml:space="preserve"> custom convention). Import </w:t>
       </w:r>
       <w:r>
         <w:rPr>
@@ -8385,13 +7383,7 @@
         <w:t xml:space="preserve">datadog/monitors/*.json</w:t>
       </w:r>
       <w:r>
-        <w:t xml:space="preserve"> </w:t>
-      </w:r>
-      <w:r>
-        <w:t xml:space="preserve">and</w:t>
-      </w:r>
-      <w:r>
-        <w:t xml:space="preserve"> </w:t>
+        <w:t xml:space="preserve"> and </w:t>
       </w:r>
       <w:r>
         <w:rPr>
@@ -8400,13 +7392,7 @@
         <w:t xml:space="preserve">datadog/slos/*.json</w:t>
       </w:r>
       <w:r>
-        <w:t xml:space="preserve"> </w:t>
-      </w:r>
-      <w:r>
-        <w:t xml:space="preserve">similarly. Leave all monitor</w:t>
-      </w:r>
-      <w:r>
-        <w:t xml:space="preserve"> </w:t>
+        <w:t xml:space="preserve"> similarly. Leave all monitor </w:t>
       </w:r>
       <w:r>
         <w:rPr>
@@ -8415,10 +7401,7 @@
         <w:t xml:space="preserve">notify</w:t>
       </w:r>
       <w:r>
-        <w:t xml:space="preserve"> </w:t>
-      </w:r>
-      <w:r>
-        <w:t xml:space="preserve">targets pointed at a staging Slack channel, not the real on-call rotation.</w:t>
+        <w:t xml:space="preserve"> targets pointed at a staging Slack channel, not the real on-call rotation.</w:t>
       </w:r>
     </w:p>
     <w:p>
@@ -8432,13 +7415,7 @@
         <w:t xml:space="preserve">Human gate:</w:t>
       </w:r>
       <w:r>
-        <w:t xml:space="preserve"> </w:t>
-      </w:r>
-      <w:r>
-        <w:t xml:space="preserve">platform engineering validates dashboard queries against known-good staging traffic; only then is a second PR opened to re-point</w:t>
-      </w:r>
-      <w:r>
-        <w:t xml:space="preserve"> </w:t>
+        <w:t xml:space="preserve"> platform engineering validates dashboard queries against known-good staging traffic; only then is a second PR opened to re-point </w:t>
       </w:r>
       <w:r>
         <w:rPr>
@@ -8447,10 +7424,7 @@
         <w:t xml:space="preserve">notify</w:t>
       </w:r>
       <w:r>
-        <w:t xml:space="preserve"> </w:t>
-      </w:r>
-      <w:r>
-        <w:t xml:space="preserve">targets at the real on-call rotation (</w:t>
+        <w:t xml:space="preserve"> targets at the real on-call rotation (</w:t>
       </w:r>
       <w:r>
         <w:rPr>
@@ -8459,10 +7433,7 @@
         <w:t xml:space="preserve">@pagerduty-genai-oncall</w:t>
       </w:r>
       <w:r>
-        <w:t xml:space="preserve">,</w:t>
-      </w:r>
-      <w:r>
-        <w:t xml:space="preserve"> </w:t>
+        <w:t xml:space="preserve">, </w:t>
       </w:r>
       <w:r>
         <w:rPr>
@@ -8495,10 +7466,7 @@
         <w:t xml:space="preserve">Goal:</w:t>
       </w:r>
       <w:r>
-        <w:t xml:space="preserve"> </w:t>
-      </w:r>
-      <w:r>
-        <w:t xml:space="preserve">close the single biggest gap this repo is explicit about — replace the synthetic evaluation-harness series with a real one.</w:t>
+        <w:t xml:space="preserve"> close the single biggest gap this repo is explicit about — replace the synthetic evaluation-harness series with a real one.</w:t>
       </w:r>
     </w:p>
     <w:p>
@@ -8514,16 +7482,7 @@
         <w:pStyle w:val="BodyText"/>
       </w:pPr>
       <w:r>
-        <w:t xml:space="preserve">Prompt-ready task (narrow, supporting role only):</w:t>
-      </w:r>
-      <w:r>
-        <w:t xml:space="preserve"> </w:t>
-      </w:r>
-      <w:r>
-        <w:t xml:space="preserve">&gt; Scaffold the plumbing to call [chosen evaluation service] on a scheduled basis against sampled production traffic, and emit</w:t>
-      </w:r>
-      <w:r>
-        <w:t xml:space="preserve"> </w:t>
+        <w:t xml:space="preserve">Prompt-ready task (narrow, supporting role only): &gt; Scaffold the plumbing to call [chosen evaluation service] on a scheduled basis against sampled production traffic, and emit </w:t>
       </w:r>
       <w:r>
         <w:rPr>
@@ -8532,10 +7491,7 @@
         <w:t xml:space="preserve">genai.eval.groundedness_score</w:t>
       </w:r>
       <w:r>
-        <w:t xml:space="preserve">,</w:t>
-      </w:r>
-      <w:r>
-        <w:t xml:space="preserve"> </w:t>
+        <w:t xml:space="preserve">, </w:t>
       </w:r>
       <w:r>
         <w:rPr>
@@ -8544,10 +7500,7 @@
         <w:t xml:space="preserve">genai.eval.citation_accuracy_score</w:t>
       </w:r>
       <w:r>
-        <w:t xml:space="preserve">,</w:t>
-      </w:r>
-      <w:r>
-        <w:t xml:space="preserve"> </w:t>
+        <w:t xml:space="preserve">, </w:t>
       </w:r>
       <w:r>
         <w:rPr>
@@ -8556,10 +7509,7 @@
         <w:t xml:space="preserve">genai.eval.hallucination_flag</w:t>
       </w:r>
       <w:r>
-        <w:t xml:space="preserve">,</w:t>
-      </w:r>
-      <w:r>
-        <w:t xml:space="preserve"> </w:t>
+        <w:t xml:space="preserve">, </w:t>
       </w:r>
       <w:r>
         <w:rPr>
@@ -8568,13 +7518,7 @@
         <w:t xml:space="preserve">genai.eval.regression_pass_rate</w:t>
       </w:r>
       <w:r>
-        <w:t xml:space="preserve"> </w:t>
-      </w:r>
-      <w:r>
-        <w:t xml:space="preserve">and</w:t>
-      </w:r>
-      <w:r>
-        <w:t xml:space="preserve"> </w:t>
+        <w:t xml:space="preserve"> and </w:t>
       </w:r>
       <w:r>
         <w:rPr>
@@ -8583,10 +7527,7 @@
         <w:t xml:space="preserve">genai.eval.golden_set_accuracy</w:t>
       </w:r>
       <w:r>
-        <w:t xml:space="preserve"> </w:t>
-      </w:r>
-      <w:r>
-        <w:t xml:space="preserve">(see metric namespace table) in the same shape the RAG and Release dashboards already expect. Do not select the evaluation methodology or curate golden sets — that decision belongs to Responsible AI/Risk and Data Governance.</w:t>
+        <w:t xml:space="preserve"> (see metric namespace table) in the same shape the RAG and Release dashboards already expect. Do not select the evaluation methodology or curate golden sets — that decision belongs to Responsible AI/Risk and Data Governance.</w:t>
       </w:r>
     </w:p>
     <w:p>
@@ -8600,10 +7541,7 @@
         <w:t xml:space="preserve">Human gate:</w:t>
       </w:r>
       <w:r>
-        <w:t xml:space="preserve"> </w:t>
-      </w:r>
-      <w:r>
-        <w:t xml:space="preserve">Responsible AI/Risk signs off on the evaluation methodology before its output is used to gate any release (i.e., before regression-pass-rate is wired into an actual release-blocking check).</w:t>
+        <w:t xml:space="preserve"> Responsible AI/Risk signs off on the evaluation methodology before its output is used to gate any release (i.e., before regression-pass-rate is wired into an actual release-blocking check).</w:t>
       </w:r>
     </w:p>
     <w:p>
@@ -8627,10 +7565,7 @@
         <w:t xml:space="preserve">Goal:</w:t>
       </w:r>
       <w:r>
-        <w:t xml:space="preserve"> </w:t>
-      </w:r>
-      <w:r>
-        <w:t xml:space="preserve">extract this single-use-case implementation into a reusable instrumentation library and onboarding pattern.</w:t>
+        <w:t xml:space="preserve"> extract this single-use-case implementation into a reusable instrumentation library and onboarding pattern.</w:t>
       </w:r>
     </w:p>
     <w:p>
@@ -8638,16 +7573,7 @@
         <w:pStyle w:val="BodyText"/>
       </w:pPr>
       <w:r>
-        <w:t xml:space="preserve">Prompt-ready task:</w:t>
-      </w:r>
-      <w:r>
-        <w:t xml:space="preserve"> </w:t>
-      </w:r>
-      <w:r>
-        <w:t xml:space="preserve">&gt; Extract the Phase 1–3 instrumentation, dashboard templates and monitor/SLO templates into a versioned internal package (or shared repo) with parameterised</w:t>
-      </w:r>
-      <w:r>
-        <w:t xml:space="preserve"> </w:t>
+        <w:t xml:space="preserve">Prompt-ready task: &gt; Extract the Phase 1–3 instrumentation, dashboard templates and monitor/SLO templates into a versioned internal package (or shared repo) with parameterised </w:t>
       </w:r>
       <w:r>
         <w:rPr>
@@ -8656,10 +7582,7 @@
         <w:t xml:space="preserve">use_case</w:t>
       </w:r>
       <w:r>
-        <w:t xml:space="preserve">,</w:t>
-      </w:r>
-      <w:r>
-        <w:t xml:space="preserve"> </w:t>
+        <w:t xml:space="preserve">, </w:t>
       </w:r>
       <w:r>
         <w:rPr>
@@ -8668,13 +7591,7 @@
         <w:t xml:space="preserve">tenant</w:t>
       </w:r>
       <w:r>
-        <w:t xml:space="preserve"> </w:t>
-      </w:r>
-      <w:r>
-        <w:t xml:space="preserve">and</w:t>
-      </w:r>
-      <w:r>
-        <w:t xml:space="preserve"> </w:t>
+        <w:t xml:space="preserve"> and </w:t>
       </w:r>
       <w:r>
         <w:rPr>
@@ -8683,10 +7600,7 @@
         <w:t xml:space="preserve">risk_tier</w:t>
       </w:r>
       <w:r>
-        <w:t xml:space="preserve"> </w:t>
-      </w:r>
-      <w:r>
-        <w:t xml:space="preserve">values, and write an onboarding checklist a second team could follow without platform-engineering hand-holding. Do not change the underlying telemetry contract while doing this — this phase is about packaging, not schema redesign.</w:t>
+        <w:t xml:space="preserve"> values, and write an onboarding checklist a second team could follow without platform-engineering hand-holding. Do not change the underlying telemetry contract while doing this — this phase is about packaging, not schema redesign.</w:t>
       </w:r>
     </w:p>
     <w:p>
@@ -8700,10 +7614,7 @@
         <w:t xml:space="preserve">Human gate:</w:t>
       </w:r>
       <w:r>
-        <w:t xml:space="preserve"> </w:t>
-      </w:r>
-      <w:r>
-        <w:t xml:space="preserve">a second, genuinely different use case attempts onboarding using only the checklist, with platform engineering observing but not intervening — if intervention is needed, the checklist has a gap.</w:t>
+        <w:t xml:space="preserve"> a second, genuinely different use case attempts onboarding using only the checklist, with platform engineering observing but not intervening — if intervention is needed, the checklist has a gap.</w:t>
       </w:r>
     </w:p>
     <w:p>
@@ -9069,13 +7980,7 @@
         <w:t xml:space="preserve">Diagram — phased sequencing maps to the mock-to-real migration and roadmap already introduced in this guide</w:t>
       </w:r>
       <w:r>
-        <w:t xml:space="preserve"> </w:t>
-      </w:r>
-      <w:r>
-        <w:t xml:space="preserve">(see</w:t>
-      </w:r>
-      <w:r>
-        <w:t xml:space="preserve"> </w:t>
+        <w:t xml:space="preserve"> (see </w:t>
       </w:r>
       <w:r>
         <w:rPr>
@@ -9084,13 +7989,7 @@
         <w:t xml:space="preserve">04-roadmap-and-next-steps.md</w:t>
       </w:r>
       <w:r>
-        <w:t xml:space="preserve"> </w:t>
-      </w:r>
-      <w:r>
-        <w:t xml:space="preserve">and</w:t>
-      </w:r>
-      <w:r>
-        <w:t xml:space="preserve"> </w:t>
+        <w:t xml:space="preserve"> and </w:t>
       </w:r>
       <w:r>
         <w:rPr>
@@ -9099,10 +7998,7 @@
         <w:t xml:space="preserve">05-datadog-implementation-reference.md</w:t>
       </w:r>
       <w:r>
-        <w:t xml:space="preserve"> </w:t>
-      </w:r>
-      <w:r>
-        <w:t xml:space="preserve">for the full-size versions of the mock-to-real migration and Datadog architecture diagrams).</w:t>
+        <w:t xml:space="preserve"> for the full-size versions of the mock-to-real migration and Datadog architecture diagrams).</w:t>
       </w:r>
     </w:p>
     <w:sectPr/>
@@ -9630,7 +8526,7 @@
       <w:rFonts w:asciiTheme="majorHAnsi" w:eastAsiaTheme="majorEastAsia" w:hAnsiTheme="majorHAnsi" w:cstheme="majorBidi"/>
       <w:b/>
       <w:bCs/>
-      <w:color w:val="345A8A" w:themeColor="accent1" w:themeShade="B5"/>
+      <w:color w:val="2A363B" w:themeColor="accent1" w:themeShade="B5"/>
       <w:sz w:val="36"/>
       <w:szCs w:val="36"/>
     </w:rPr>
@@ -9710,7 +8606,7 @@
       <w:rFonts w:asciiTheme="majorHAnsi" w:eastAsiaTheme="majorEastAsia" w:hAnsiTheme="majorHAnsi" w:cstheme="majorBidi"/>
       <w:b/>
       <w:bCs/>
-      <w:color w:val="4F81BD" w:themeColor="accent1"/>
+      <w:color w:val="2E7DA6" w:themeColor="accent1"/>
       <w:sz w:val="32"/>
       <w:szCs w:val="32"/>
     </w:rPr>
@@ -9732,7 +8628,7 @@
       <w:rFonts w:asciiTheme="majorHAnsi" w:eastAsiaTheme="majorEastAsia" w:hAnsiTheme="majorHAnsi" w:cstheme="majorBidi"/>
       <w:b/>
       <w:bCs/>
-      <w:color w:val="4F81BD" w:themeColor="accent1"/>
+      <w:color w:val="2E7DA6" w:themeColor="accent1"/>
       <w:sz w:val="28"/>
       <w:szCs w:val="28"/>
     </w:rPr>
@@ -9754,7 +8650,7 @@
       <w:rFonts w:asciiTheme="majorHAnsi" w:eastAsiaTheme="majorEastAsia" w:hAnsiTheme="majorHAnsi" w:cstheme="majorBidi"/>
       <w:b/>
       <w:bCs/>
-      <w:color w:val="4F81BD" w:themeColor="accent1"/>
+      <w:color w:val="2E7DA6" w:themeColor="accent1"/>
       <w:sz w:val="24"/>
       <w:szCs w:val="24"/>
     </w:rPr>
@@ -9776,7 +8672,7 @@
       <w:rFonts w:asciiTheme="majorHAnsi" w:eastAsiaTheme="majorEastAsia" w:hAnsiTheme="majorHAnsi" w:cstheme="majorBidi"/>
       <w:i/>
       <w:bCs/>
-      <w:color w:val="4F81BD" w:themeColor="accent1"/>
+      <w:color w:val="2E7DA6" w:themeColor="accent1"/>
       <w:sz w:val="24"/>
       <w:szCs w:val="24"/>
     </w:rPr>
@@ -9797,7 +8693,7 @@
     <w:rPr>
       <w:rFonts w:asciiTheme="majorHAnsi" w:eastAsiaTheme="majorEastAsia" w:hAnsiTheme="majorHAnsi" w:cstheme="majorBidi"/>
       <w:iCs/>
-      <w:color w:val="4F81BD" w:themeColor="accent1"/>
+      <w:color w:val="2E7DA6" w:themeColor="accent1"/>
       <w:sz w:val="24"/>
       <w:szCs w:val="24"/>
     </w:rPr>
@@ -9817,7 +8713,7 @@
     </w:pPr>
     <w:rPr>
       <w:rFonts w:asciiTheme="majorHAnsi" w:eastAsiaTheme="majorEastAsia" w:hAnsiTheme="majorHAnsi" w:cstheme="majorBidi"/>
-      <w:color w:val="4F81BD" w:themeColor="accent1"/>
+      <w:color w:val="2E7DA6" w:themeColor="accent1"/>
       <w:sz w:val="24"/>
       <w:szCs w:val="24"/>
     </w:rPr>
@@ -9837,7 +8733,7 @@
     </w:pPr>
     <w:rPr>
       <w:rFonts w:asciiTheme="majorHAnsi" w:eastAsiaTheme="majorEastAsia" w:hAnsiTheme="majorHAnsi" w:cstheme="majorBidi"/>
-      <w:color w:val="4F81BD" w:themeColor="accent1"/>
+      <w:color w:val="2E7DA6" w:themeColor="accent1"/>
       <w:sz w:val="24"/>
       <w:szCs w:val="24"/>
     </w:rPr>
@@ -9857,7 +8753,7 @@
     </w:pPr>
     <w:rPr>
       <w:rFonts w:asciiTheme="majorHAnsi" w:eastAsiaTheme="majorEastAsia" w:hAnsiTheme="majorHAnsi" w:cstheme="majorBidi"/>
-      <w:color w:val="4F81BD" w:themeColor="accent1"/>
+      <w:color w:val="2E7DA6" w:themeColor="accent1"/>
       <w:sz w:val="24"/>
       <w:szCs w:val="24"/>
     </w:rPr>
@@ -9877,7 +8773,7 @@
     </w:pPr>
     <w:rPr>
       <w:rFonts w:asciiTheme="majorHAnsi" w:eastAsiaTheme="majorEastAsia" w:hAnsiTheme="majorHAnsi" w:cstheme="majorBidi"/>
-      <w:color w:val="4F81BD" w:themeColor="accent1"/>
+      <w:color w:val="2E7DA6" w:themeColor="accent1"/>
       <w:sz w:val="24"/>
       <w:szCs w:val="24"/>
     </w:rPr>
@@ -9997,7 +8893,7 @@
     <w:name w:val="Hyperlink"/>
     <w:basedOn w:val="BodyTextChar"/>
     <w:rPr>
-      <w:color w:val="4F81BD" w:themeColor="accent1"/>
+      <w:color w:val="2E7DA6" w:themeColor="accent1"/>
     </w:rPr>
   </w:style>
   <w:style w:type="paragraph" w:styleId="TOCHeading">
@@ -10015,7 +8911,7 @@
       <w:rFonts w:asciiTheme="majorHAnsi" w:eastAsiaTheme="majorEastAsia" w:hAnsiTheme="majorHAnsi" w:cstheme="majorBidi"/>
       <w:b w:val="0"/>
       <w:bCs w:val="0"/>
-      <w:color w:val="365F91" w:themeColor="accent1" w:themeShade="BF"/>
+      <w:color w:val="2A363B" w:themeColor="accent1" w:themeShade="BF"/>
     </w:rPr>
   </w:style>
   <w:style w:type="paragraph" w:customStyle="1" w:styleId="SourceCode">
@@ -10176,7 +9072,7 @@
     <w:name w:val="OperatorTok"/>
     <w:basedOn w:val="VerbatimChar"/>
     <w:rPr>
-      <w:color w:val="666666"/>
+      <w:color w:val="545E63"/>
     </w:rPr>
   </w:style>
   <w:style w:type="character" w:customStyle="1" w:styleId="BuiltInTok">
@@ -10293,7 +9189,7 @@
     </a:clrScheme>
     <a:fontScheme name="Office">
       <a:majorFont>
-        <a:latin typeface="Calibri"/>
+        <a:latin typeface="Inter"/>
         <a:ea typeface=""/>
         <a:cs typeface=""/>
         <a:font script="Jpan" typeface="ＭＳ ゴシック"/>
@@ -10327,7 +9223,7 @@
         <a:font script="Uigh" typeface="Microsoft Uighur"/>
       </a:majorFont>
       <a:minorFont>
-        <a:latin typeface="Cambria"/>
+        <a:latin typeface="Poppins"/>
         <a:ea typeface=""/>
         <a:cs typeface=""/>
         <a:font script="Jpan" typeface="ＭＳ 明朝"/>

</xml_diff>